<commit_message>
TS 4.7 Kramam  Tamil and Sanskrit
</commit_message>
<xml_diff>
--- a/TS-Kramam/TS-4.7/TS 4.7 Sanskrit Krama Paatam Corrections.docx
+++ b/TS-Kramam/TS-4.7/TS 4.7 Sanskrit Krama Paatam Corrections.docx
@@ -153,12 +153,16 @@
               <w:spacing w:before="0" w:line="240" w:lineRule="auto"/>
               <w:jc w:val="center"/>
               <w:rPr>
-                <w:sz w:val="32"/>
-                <w:szCs w:val="32"/>
-              </w:rPr>
-            </w:pPr>
-            <w:r>
-              <w:rPr>
+                <w:b/>
+                <w:bCs/>
+                <w:sz w:val="32"/>
+                <w:szCs w:val="32"/>
+              </w:rPr>
+            </w:pPr>
+            <w:r>
+              <w:rPr>
+                <w:b/>
+                <w:bCs/>
                 <w:sz w:val="32"/>
                 <w:szCs w:val="32"/>
               </w:rPr>
@@ -170,12 +174,16 @@
               <w:spacing w:before="0" w:line="240" w:lineRule="auto"/>
               <w:jc w:val="center"/>
               <w:rPr>
-                <w:sz w:val="32"/>
-                <w:szCs w:val="32"/>
-              </w:rPr>
-            </w:pPr>
-            <w:r>
-              <w:rPr>
+                <w:b/>
+                <w:bCs/>
+                <w:sz w:val="32"/>
+                <w:szCs w:val="32"/>
+              </w:rPr>
+            </w:pPr>
+            <w:r>
+              <w:rPr>
+                <w:b/>
+                <w:bCs/>
                 <w:sz w:val="32"/>
                 <w:szCs w:val="32"/>
               </w:rPr>
@@ -192,12 +200,16 @@
               <w:spacing w:before="0" w:line="240" w:lineRule="auto"/>
               <w:jc w:val="center"/>
               <w:rPr>
-                <w:sz w:val="32"/>
-                <w:szCs w:val="32"/>
-              </w:rPr>
-            </w:pPr>
-            <w:r>
-              <w:rPr>
+                <w:b/>
+                <w:bCs/>
+                <w:sz w:val="32"/>
+                <w:szCs w:val="32"/>
+              </w:rPr>
+            </w:pPr>
+            <w:r>
+              <w:rPr>
+                <w:b/>
+                <w:bCs/>
                 <w:sz w:val="32"/>
                 <w:szCs w:val="32"/>
               </w:rPr>
@@ -215,12 +227,16 @@
               <w:ind w:right="-18"/>
               <w:jc w:val="center"/>
               <w:rPr>
-                <w:sz w:val="32"/>
-                <w:szCs w:val="32"/>
-              </w:rPr>
-            </w:pPr>
-            <w:r>
-              <w:rPr>
+                <w:b/>
+                <w:bCs/>
+                <w:sz w:val="32"/>
+                <w:szCs w:val="32"/>
+              </w:rPr>
+            </w:pPr>
+            <w:r>
+              <w:rPr>
+                <w:b/>
+                <w:bCs/>
                 <w:sz w:val="32"/>
                 <w:szCs w:val="32"/>
               </w:rPr>
@@ -673,6 +689,487 @@
                 <w:szCs w:val="28"/>
                 <w:lang w:bidi="ta-IN"/>
               </w:rPr>
+              <w:t>3.2</w:t>
+            </w:r>
+            <w:r>
+              <w:rPr>
+                <w:rFonts w:cs="Latha"/>
+                <w:b/>
+                <w:sz w:val="28"/>
+                <w:szCs w:val="28"/>
+                <w:lang w:bidi="ta-IN"/>
+              </w:rPr>
+              <w:t xml:space="preserve">- </w:t>
+            </w:r>
+            <w:r>
+              <w:rPr>
+                <w:rFonts w:cs="Arial"/>
+                <w:b/>
+                <w:sz w:val="28"/>
+                <w:szCs w:val="32"/>
+              </w:rPr>
+              <w:t>Kramam</w:t>
+            </w:r>
+          </w:p>
+          <w:p>
+            <w:pPr>
+              <w:spacing w:before="0" w:line="240" w:lineRule="auto"/>
+              <w:rPr>
+                <w:rFonts w:cs="Latha"/>
+                <w:b/>
+                <w:sz w:val="28"/>
+                <w:szCs w:val="28"/>
+                <w:lang w:val="en-IN" w:bidi="ta-IN"/>
+              </w:rPr>
+            </w:pPr>
+            <w:r>
+              <w:rPr>
+                <w:rFonts w:cs="Arial"/>
+                <w:b/>
+                <w:sz w:val="28"/>
+                <w:szCs w:val="32"/>
+                <w:lang w:val="en-IN"/>
+              </w:rPr>
+              <w:t>Krama Vaakyam</w:t>
+            </w:r>
+            <w:r>
+              <w:rPr>
+                <w:rFonts w:cs="Latha"/>
+                <w:b/>
+                <w:sz w:val="28"/>
+                <w:szCs w:val="28"/>
+                <w:lang w:val="en-IN" w:bidi="ta-IN"/>
+              </w:rPr>
+              <w:t xml:space="preserve"> No: - 15</w:t>
+            </w:r>
+          </w:p>
+          <w:p>
+            <w:pPr>
+              <w:widowControl w:val="0"/>
+              <w:tabs>
+                <w:tab w:val="left" w:pos="993"/>
+              </w:tabs>
+              <w:autoSpaceDE w:val="0"/>
+              <w:autoSpaceDN w:val="0"/>
+              <w:adjustRightInd w:val="0"/>
+              <w:spacing w:before="0" w:line="240" w:lineRule="auto"/>
+              <w:ind w:right="297"/>
+              <w:rPr>
+                <w:rFonts w:cs="Latha"/>
+                <w:b/>
+                <w:sz w:val="28"/>
+                <w:szCs w:val="28"/>
+                <w:lang w:bidi="ta-IN"/>
+              </w:rPr>
+            </w:pPr>
+            <w:r>
+              <w:rPr>
+                <w:rFonts w:cs="Latha"/>
+                <w:b/>
+                <w:sz w:val="28"/>
+                <w:szCs w:val="28"/>
+                <w:lang w:val="it-IT" w:bidi="ta-IN"/>
+              </w:rPr>
+              <w:t xml:space="preserve">Panchaati No. - </w:t>
+            </w:r>
+            <w:r>
+              <w:rPr>
+                <w:rFonts w:cs="Latha"/>
+                <w:b/>
+                <w:sz w:val="28"/>
+                <w:szCs w:val="28"/>
+                <w:lang w:val="it-IT" w:bidi="ta-IN"/>
+              </w:rPr>
+              <w:t>25</w:t>
+            </w:r>
+          </w:p>
+        </w:tc>
+        <w:tc>
+          <w:tcPr>
+            <w:tcW w:w="5103" w:type="dxa"/>
+            <w:tcBorders>
+              <w:top w:val="single" w:sz="4" w:space="0" w:color="000000"/>
+              <w:left w:val="single" w:sz="4" w:space="0" w:color="000000"/>
+              <w:bottom w:val="single" w:sz="4" w:space="0" w:color="000000"/>
+              <w:right w:val="single" w:sz="4" w:space="0" w:color="000000"/>
+            </w:tcBorders>
+          </w:tcPr>
+          <w:p>
+            <w:pPr>
+              <w:spacing w:before="0" w:line="240" w:lineRule="auto"/>
+              <w:rPr>
+                <w:rFonts w:ascii="BRH Devanagari Extra" w:hAnsi="BRH Devanagari Extra" w:cs="BRH Devanagari Extra"/>
+                <w:color w:val="000000"/>
+                <w:sz w:val="40"/>
+                <w:szCs w:val="40"/>
+                <w:lang w:val="it-IT" w:bidi="ml-IN"/>
+              </w:rPr>
+            </w:pPr>
+            <w:proofErr w:type="spellStart"/>
+            <w:r>
+              <w:rPr>
+                <w:rFonts w:ascii="BRH Devanagari Extra" w:hAnsi="BRH Devanagari Extra" w:cs="BRH Devanagari Extra"/>
+                <w:color w:val="000000"/>
+                <w:sz w:val="40"/>
+                <w:szCs w:val="40"/>
+                <w:lang w:bidi="ml-IN"/>
+              </w:rPr>
+              <w:t>lÉqÉþxmÉ</w:t>
+            </w:r>
+            <w:proofErr w:type="spellEnd"/>
+            <w:r>
+              <w:rPr>
+                <w:rFonts w:ascii="BRH Tamil Tab Extra" w:hAnsi="BRH Tamil Tab Extra" w:cs="BRH Devanagari Extra"/>
+                <w:color w:val="000000"/>
+                <w:sz w:val="32"/>
+                <w:szCs w:val="40"/>
+                <w:lang w:bidi="ml-IN"/>
+              </w:rPr>
+              <w:t>…</w:t>
+            </w:r>
+            <w:proofErr w:type="spellStart"/>
+            <w:r>
+              <w:rPr>
+                <w:rFonts w:ascii="BRH Devanagari Extra" w:hAnsi="BRH Devanagari Extra" w:cs="BRH Devanagari Extra"/>
+                <w:color w:val="000000"/>
+                <w:sz w:val="40"/>
+                <w:szCs w:val="40"/>
+                <w:lang w:bidi="ml-IN"/>
+              </w:rPr>
+              <w:t>jÉ</w:t>
+            </w:r>
+            <w:r>
+              <w:rPr>
+                <w:rFonts w:ascii="BRH Devanagari Extra" w:hAnsi="BRH Devanagari Extra" w:cs="BRH Devanagari Extra"/>
+                <w:color w:val="000000"/>
+                <w:sz w:val="40"/>
+                <w:szCs w:val="40"/>
+                <w:lang w:bidi="ml-IN"/>
+              </w:rPr>
+              <w:t>å</w:t>
+            </w:r>
+            <w:proofErr w:type="spellEnd"/>
+            <w:r>
+              <w:rPr>
+                <w:rFonts w:ascii="BRH Devanagari Extra" w:hAnsi="BRH Devanagari Extra" w:cs="BRH Devanagari Extra"/>
+                <w:color w:val="000000"/>
+                <w:sz w:val="40"/>
+                <w:szCs w:val="40"/>
+                <w:lang w:bidi="ml-IN"/>
+              </w:rPr>
+              <w:t xml:space="preserve"> | mÉ</w:t>
+            </w:r>
+            <w:r>
+              <w:rPr>
+                <w:rFonts w:ascii="BRH Tamil Tab Extra" w:hAnsi="BRH Tamil Tab Extra" w:cs="BRH Devanagari Extra"/>
+                <w:color w:val="000000"/>
+                <w:sz w:val="32"/>
+                <w:szCs w:val="40"/>
+                <w:lang w:bidi="ml-IN"/>
+              </w:rPr>
+              <w:t>…</w:t>
+            </w:r>
+            <w:r>
+              <w:rPr>
+                <w:rFonts w:ascii="BRH Devanagari Extra" w:hAnsi="BRH Devanagari Extra" w:cs="BRH Devanagari Extra"/>
+                <w:color w:val="000000"/>
+                <w:sz w:val="40"/>
+                <w:szCs w:val="40"/>
+                <w:lang w:bidi="ml-IN"/>
+              </w:rPr>
+              <w:t xml:space="preserve">jÉ </w:t>
+            </w:r>
+            <w:proofErr w:type="spellStart"/>
+            <w:r>
+              <w:rPr>
+                <w:rFonts w:ascii="BRH Devanagari Extra" w:hAnsi="BRH Devanagari Extra" w:cs="BRH Devanagari Extra"/>
+                <w:color w:val="000000"/>
+                <w:sz w:val="40"/>
+                <w:szCs w:val="40"/>
+                <w:lang w:bidi="ml-IN"/>
+              </w:rPr>
+              <w:t>CÌiÉþ</w:t>
+            </w:r>
+            <w:proofErr w:type="spellEnd"/>
+            <w:r>
+              <w:rPr>
+                <w:rFonts w:ascii="BRH Devanagari Extra" w:hAnsi="BRH Devanagari Extra" w:cs="BRH Devanagari Extra"/>
+                <w:color w:val="000000"/>
+                <w:sz w:val="40"/>
+                <w:szCs w:val="40"/>
+                <w:lang w:bidi="ml-IN"/>
+              </w:rPr>
+              <w:t xml:space="preserve"> </w:t>
+            </w:r>
+            <w:proofErr w:type="spellStart"/>
+            <w:r>
+              <w:rPr>
+                <w:rFonts w:ascii="BRH Devanagari Extra" w:hAnsi="BRH Devanagari Extra" w:cs="BRH Devanagari Extra"/>
+                <w:color w:val="000000"/>
+                <w:sz w:val="40"/>
+                <w:szCs w:val="40"/>
+                <w:highlight w:val="yellow"/>
+                <w:lang w:bidi="ml-IN"/>
+              </w:rPr>
+              <w:t>mÉj</w:t>
+            </w:r>
+            <w:r>
+              <w:rPr>
+                <w:rFonts w:ascii="BRH Devanagari Extra" w:hAnsi="BRH Devanagari Extra" w:cs="BRH Devanagari Extra"/>
+                <w:color w:val="000000"/>
+                <w:sz w:val="40"/>
+                <w:szCs w:val="40"/>
+                <w:lang w:bidi="ml-IN"/>
+              </w:rPr>
+              <w:t>É</w:t>
+            </w:r>
+            <w:r>
+              <w:rPr>
+                <w:rFonts w:ascii="BRH Devanagari Extra" w:hAnsi="BRH Devanagari Extra" w:cs="BRH Devanagari Extra"/>
+                <w:color w:val="000000"/>
+                <w:sz w:val="40"/>
+                <w:szCs w:val="40"/>
+                <w:lang w:bidi="ml-IN"/>
+              </w:rPr>
+              <w:t>å</w:t>
+            </w:r>
+            <w:proofErr w:type="spellEnd"/>
+            <w:r>
+              <w:rPr>
+                <w:rFonts w:ascii="BRH Devanagari Extra" w:hAnsi="BRH Devanagari Extra" w:cs="BRH Devanagari Extra"/>
+                <w:color w:val="000000"/>
+                <w:sz w:val="40"/>
+                <w:szCs w:val="40"/>
+                <w:lang w:bidi="ml-IN"/>
+              </w:rPr>
+              <w:t xml:space="preserve"> ||</w:t>
+            </w:r>
+          </w:p>
+        </w:tc>
+        <w:tc>
+          <w:tcPr>
+            <w:tcW w:w="5386" w:type="dxa"/>
+            <w:tcBorders>
+              <w:top w:val="single" w:sz="4" w:space="0" w:color="000000"/>
+              <w:left w:val="single" w:sz="4" w:space="0" w:color="000000"/>
+              <w:bottom w:val="single" w:sz="4" w:space="0" w:color="000000"/>
+              <w:right w:val="single" w:sz="4" w:space="0" w:color="000000"/>
+            </w:tcBorders>
+          </w:tcPr>
+          <w:p>
+            <w:pPr>
+              <w:spacing w:before="0" w:line="240" w:lineRule="auto"/>
+              <w:rPr>
+                <w:rFonts w:ascii="BRH Devanagari Extra" w:hAnsi="BRH Devanagari Extra" w:cs="BRH Devanagari Extra"/>
+                <w:color w:val="000000"/>
+                <w:sz w:val="40"/>
+                <w:szCs w:val="40"/>
+                <w:lang w:val="it-IT" w:bidi="ml-IN"/>
+              </w:rPr>
+            </w:pPr>
+            <w:proofErr w:type="spellStart"/>
+            <w:r>
+              <w:rPr>
+                <w:rFonts w:ascii="BRH Devanagari Extra" w:hAnsi="BRH Devanagari Extra" w:cs="BRH Devanagari Extra"/>
+                <w:color w:val="000000"/>
+                <w:sz w:val="40"/>
+                <w:szCs w:val="40"/>
+                <w:lang w:bidi="ml-IN"/>
+              </w:rPr>
+              <w:t>lÉqÉþxmÉ</w:t>
+            </w:r>
+            <w:proofErr w:type="spellEnd"/>
+            <w:r>
+              <w:rPr>
+                <w:rFonts w:ascii="BRH Tamil Tab Extra" w:hAnsi="BRH Tamil Tab Extra" w:cs="BRH Devanagari Extra"/>
+                <w:color w:val="000000"/>
+                <w:sz w:val="32"/>
+                <w:szCs w:val="40"/>
+                <w:lang w:bidi="ml-IN"/>
+              </w:rPr>
+              <w:t>…</w:t>
+            </w:r>
+            <w:proofErr w:type="spellStart"/>
+            <w:r>
+              <w:rPr>
+                <w:rFonts w:ascii="BRH Devanagari Extra" w:hAnsi="BRH Devanagari Extra" w:cs="BRH Devanagari Extra"/>
+                <w:color w:val="000000"/>
+                <w:sz w:val="40"/>
+                <w:szCs w:val="40"/>
+                <w:lang w:bidi="ml-IN"/>
+              </w:rPr>
+              <w:t>jÉ</w:t>
+            </w:r>
+            <w:r>
+              <w:rPr>
+                <w:rFonts w:ascii="BRH Devanagari Extra" w:hAnsi="BRH Devanagari Extra" w:cs="BRH Devanagari Extra"/>
+                <w:color w:val="000000"/>
+                <w:sz w:val="40"/>
+                <w:szCs w:val="40"/>
+                <w:lang w:bidi="ml-IN"/>
+              </w:rPr>
+              <w:t>å</w:t>
+            </w:r>
+            <w:proofErr w:type="spellEnd"/>
+            <w:r>
+              <w:rPr>
+                <w:rFonts w:ascii="BRH Devanagari Extra" w:hAnsi="BRH Devanagari Extra" w:cs="BRH Devanagari Extra"/>
+                <w:color w:val="000000"/>
+                <w:sz w:val="40"/>
+                <w:szCs w:val="40"/>
+                <w:lang w:bidi="ml-IN"/>
+              </w:rPr>
+              <w:t xml:space="preserve"> | mÉ</w:t>
+            </w:r>
+            <w:r>
+              <w:rPr>
+                <w:rFonts w:ascii="BRH Tamil Tab Extra" w:hAnsi="BRH Tamil Tab Extra" w:cs="BRH Devanagari Extra"/>
+                <w:color w:val="000000"/>
+                <w:sz w:val="32"/>
+                <w:szCs w:val="40"/>
+                <w:lang w:bidi="ml-IN"/>
+              </w:rPr>
+              <w:t>…</w:t>
+            </w:r>
+            <w:r>
+              <w:rPr>
+                <w:rFonts w:ascii="BRH Devanagari Extra" w:hAnsi="BRH Devanagari Extra" w:cs="BRH Devanagari Extra"/>
+                <w:color w:val="000000"/>
+                <w:sz w:val="40"/>
+                <w:szCs w:val="40"/>
+                <w:lang w:bidi="ml-IN"/>
+              </w:rPr>
+              <w:t xml:space="preserve">jÉ </w:t>
+            </w:r>
+            <w:proofErr w:type="spellStart"/>
+            <w:r>
+              <w:rPr>
+                <w:rFonts w:ascii="BRH Devanagari Extra" w:hAnsi="BRH Devanagari Extra" w:cs="BRH Devanagari Extra"/>
+                <w:color w:val="000000"/>
+                <w:sz w:val="40"/>
+                <w:szCs w:val="40"/>
+                <w:lang w:bidi="ml-IN"/>
+              </w:rPr>
+              <w:t>CÌiÉþ</w:t>
+            </w:r>
+            <w:proofErr w:type="spellEnd"/>
+            <w:r>
+              <w:rPr>
+                <w:rFonts w:ascii="BRH Devanagari Extra" w:hAnsi="BRH Devanagari Extra" w:cs="BRH Devanagari Extra"/>
+                <w:color w:val="000000"/>
+                <w:sz w:val="40"/>
+                <w:szCs w:val="40"/>
+                <w:lang w:bidi="ml-IN"/>
+              </w:rPr>
+              <w:t xml:space="preserve"> </w:t>
+            </w:r>
+            <w:r>
+              <w:rPr>
+                <w:rFonts w:ascii="BRH Devanagari Extra" w:hAnsi="BRH Devanagari Extra" w:cs="BRH Devanagari Extra"/>
+                <w:color w:val="000000"/>
+                <w:sz w:val="40"/>
+                <w:szCs w:val="40"/>
+                <w:highlight w:val="green"/>
+                <w:lang w:bidi="ml-IN"/>
+              </w:rPr>
+              <w:t>mÉ</w:t>
+            </w:r>
+            <w:r>
+              <w:rPr>
+                <w:rFonts w:ascii="BRH Tamil Tab Extra" w:hAnsi="BRH Tamil Tab Extra" w:cs="BRH Devanagari Extra"/>
+                <w:color w:val="000000"/>
+                <w:sz w:val="32"/>
+                <w:szCs w:val="40"/>
+                <w:highlight w:val="green"/>
+                <w:lang w:bidi="ml-IN"/>
+              </w:rPr>
+              <w:t>…</w:t>
+            </w:r>
+            <w:proofErr w:type="spellStart"/>
+            <w:r>
+              <w:rPr>
+                <w:rFonts w:ascii="BRH Devanagari Extra" w:hAnsi="BRH Devanagari Extra" w:cs="BRH Devanagari Extra"/>
+                <w:color w:val="000000"/>
+                <w:sz w:val="40"/>
+                <w:szCs w:val="40"/>
+                <w:lang w:bidi="ml-IN"/>
+              </w:rPr>
+              <w:t>jÉ</w:t>
+            </w:r>
+            <w:r>
+              <w:rPr>
+                <w:rFonts w:ascii="BRH Devanagari Extra" w:hAnsi="BRH Devanagari Extra" w:cs="BRH Devanagari Extra"/>
+                <w:color w:val="000000"/>
+                <w:sz w:val="40"/>
+                <w:szCs w:val="40"/>
+                <w:lang w:bidi="ml-IN"/>
+              </w:rPr>
+              <w:t>å</w:t>
+            </w:r>
+            <w:proofErr w:type="spellEnd"/>
+            <w:r>
+              <w:rPr>
+                <w:rFonts w:ascii="BRH Devanagari Extra" w:hAnsi="BRH Devanagari Extra" w:cs="BRH Devanagari Extra"/>
+                <w:color w:val="000000"/>
+                <w:sz w:val="40"/>
+                <w:szCs w:val="40"/>
+                <w:lang w:bidi="ml-IN"/>
+              </w:rPr>
+              <w:t xml:space="preserve"> ||</w:t>
+            </w:r>
+          </w:p>
+        </w:tc>
+      </w:tr>
+      <w:tr>
+        <w:trPr>
+          <w:trHeight w:val="1400"/>
+        </w:trPr>
+        <w:tc>
+          <w:tcPr>
+            <w:tcW w:w="3906" w:type="dxa"/>
+            <w:tcBorders>
+              <w:top w:val="single" w:sz="4" w:space="0" w:color="000000"/>
+              <w:left w:val="single" w:sz="4" w:space="0" w:color="000000"/>
+              <w:bottom w:val="single" w:sz="4" w:space="0" w:color="000000"/>
+              <w:right w:val="single" w:sz="4" w:space="0" w:color="000000"/>
+            </w:tcBorders>
+          </w:tcPr>
+          <w:p>
+            <w:pPr>
+              <w:widowControl w:val="0"/>
+              <w:tabs>
+                <w:tab w:val="left" w:pos="993"/>
+              </w:tabs>
+              <w:autoSpaceDE w:val="0"/>
+              <w:autoSpaceDN w:val="0"/>
+              <w:adjustRightInd w:val="0"/>
+              <w:spacing w:before="0" w:line="240" w:lineRule="auto"/>
+              <w:ind w:right="297"/>
+              <w:rPr>
+                <w:rFonts w:cs="Arial"/>
+                <w:b/>
+                <w:sz w:val="28"/>
+                <w:szCs w:val="32"/>
+              </w:rPr>
+            </w:pPr>
+            <w:r>
+              <w:rPr>
+                <w:rFonts w:cs="Latha"/>
+                <w:b/>
+                <w:sz w:val="28"/>
+                <w:szCs w:val="28"/>
+                <w:lang w:bidi="ta-IN"/>
+              </w:rPr>
+              <w:t>TS 4.7.1</w:t>
+            </w:r>
+            <w:r>
+              <w:rPr>
+                <w:rFonts w:cs="Latha"/>
+                <w:b/>
+                <w:sz w:val="28"/>
+                <w:szCs w:val="28"/>
+                <w:lang w:bidi="ta-IN"/>
+              </w:rPr>
               <w:t>3.3</w:t>
             </w:r>
             <w:r>
@@ -1167,6 +1664,7 @@
                 <w:lang w:val="it-IT" w:eastAsia="en-IN" w:bidi="ml-IN"/>
               </w:rPr>
             </w:pPr>
+            <w:proofErr w:type="spellStart"/>
             <w:r>
               <w:rPr>
                 <w:rFonts w:ascii="BRH Devanagari Extra" w:hAnsi="BRH Devanagari Extra" w:cs="BRH Devanagari Extra"/>
@@ -1177,6 +1675,7 @@
               </w:rPr>
               <w:t>ÌWûUþhrÉæ</w:t>
             </w:r>
+            <w:proofErr w:type="spellEnd"/>
             <w:r>
               <w:rPr>
                 <w:rFonts w:ascii="BRH Tamil Tab Extra" w:hAnsi="BRH Tamil Tab Extra" w:cs="BRH Devanagari Extra"/>
@@ -1187,6 +1686,7 @@
               </w:rPr>
               <w:t>…</w:t>
             </w:r>
+            <w:proofErr w:type="spellStart"/>
             <w:r>
               <w:rPr>
                 <w:rFonts w:ascii="BRH Devanagari Extra" w:hAnsi="BRH Devanagari Extra" w:cs="BRH Devanagari Extra"/>
@@ -1197,6 +1697,7 @@
               </w:rPr>
               <w:t>ËUÌiÉ</w:t>
             </w:r>
+            <w:proofErr w:type="spellEnd"/>
             <w:r>
               <w:rPr>
                 <w:rFonts w:ascii="BRH Tamil Tab Extra" w:hAnsi="BRH Tamil Tab Extra" w:cs="BRH Devanagari Extra"/>
@@ -1215,7 +1716,18 @@
                 <w:szCs w:val="40"/>
                 <w:lang w:bidi="ml-IN"/>
               </w:rPr>
-              <w:t xml:space="preserve"> ÌWû</w:t>
+              <w:t xml:space="preserve"> </w:t>
+            </w:r>
+            <w:proofErr w:type="spellStart"/>
+            <w:r>
+              <w:rPr>
+                <w:rFonts w:ascii="BRH Devanagari Extra" w:hAnsi="BRH Devanagari Extra" w:cs="BRH Devanagari Extra"/>
+                <w:color w:val="000000"/>
+                <w:sz w:val="40"/>
+                <w:szCs w:val="40"/>
+                <w:lang w:bidi="ml-IN"/>
+              </w:rPr>
+              <w:t>ÌWû</w:t>
             </w:r>
             <w:r>
               <w:rPr>
@@ -1236,7 +1748,18 @@
                 <w:szCs w:val="40"/>
                 <w:lang w:bidi="ml-IN"/>
               </w:rPr>
-              <w:t>ÿhrÉæÈ ||</w:t>
+              <w:t>ÿhrÉæÈ</w:t>
+            </w:r>
+            <w:proofErr w:type="spellEnd"/>
+            <w:r>
+              <w:rPr>
+                <w:rFonts w:ascii="BRH Devanagari Extra" w:hAnsi="BRH Devanagari Extra" w:cs="BRH Devanagari Extra"/>
+                <w:color w:val="000000"/>
+                <w:sz w:val="40"/>
+                <w:szCs w:val="40"/>
+                <w:lang w:bidi="ml-IN"/>
+              </w:rPr>
+              <w:t xml:space="preserve"> ||</w:t>
             </w:r>
           </w:p>
         </w:tc>
@@ -1261,6 +1784,7 @@
                 <w:lang w:val="it-IT" w:eastAsia="en-IN" w:bidi="ml-IN"/>
               </w:rPr>
             </w:pPr>
+            <w:proofErr w:type="spellStart"/>
             <w:r>
               <w:rPr>
                 <w:rFonts w:ascii="BRH Devanagari Extra" w:hAnsi="BRH Devanagari Extra" w:cs="BRH Devanagari Extra"/>
@@ -1271,6 +1795,7 @@
               </w:rPr>
               <w:t>ÌWûUþhrÉæ</w:t>
             </w:r>
+            <w:proofErr w:type="spellEnd"/>
             <w:r>
               <w:rPr>
                 <w:rFonts w:ascii="BRH Tamil Tab Extra" w:hAnsi="BRH Tamil Tab Extra" w:cs="BRH Devanagari Extra"/>
@@ -1281,6 +1806,7 @@
               </w:rPr>
               <w:t>…</w:t>
             </w:r>
+            <w:proofErr w:type="spellStart"/>
             <w:r>
               <w:rPr>
                 <w:rFonts w:ascii="BRH Devanagari Extra" w:hAnsi="BRH Devanagari Extra" w:cs="BRH Devanagari Extra"/>
@@ -1291,6 +1817,7 @@
               </w:rPr>
               <w:t>ËUÌiÉ</w:t>
             </w:r>
+            <w:proofErr w:type="spellEnd"/>
             <w:r>
               <w:rPr>
                 <w:rFonts w:ascii="BRH Tamil Tab Extra" w:hAnsi="BRH Tamil Tab Extra" w:cs="BRH Devanagari Extra"/>
@@ -1309,7 +1836,18 @@
                 <w:szCs w:val="40"/>
                 <w:lang w:bidi="ml-IN"/>
               </w:rPr>
-              <w:t xml:space="preserve"> ÌWû</w:t>
+              <w:t xml:space="preserve"> </w:t>
+            </w:r>
+            <w:proofErr w:type="spellStart"/>
+            <w:r>
+              <w:rPr>
+                <w:rFonts w:ascii="BRH Devanagari Extra" w:hAnsi="BRH Devanagari Extra" w:cs="BRH Devanagari Extra"/>
+                <w:color w:val="000000"/>
+                <w:sz w:val="40"/>
+                <w:szCs w:val="40"/>
+                <w:lang w:bidi="ml-IN"/>
+              </w:rPr>
+              <w:t>ÌWû</w:t>
             </w:r>
             <w:r>
               <w:rPr>
@@ -1330,8 +1868,429 @@
                 <w:szCs w:val="40"/>
                 <w:lang w:bidi="ml-IN"/>
               </w:rPr>
-              <w:t>þhrÉæÈ ||</w:t>
-            </w:r>
+              <w:t>þhrÉæÈ</w:t>
+            </w:r>
+            <w:proofErr w:type="spellEnd"/>
+            <w:r>
+              <w:rPr>
+                <w:rFonts w:ascii="BRH Devanagari Extra" w:hAnsi="BRH Devanagari Extra" w:cs="BRH Devanagari Extra"/>
+                <w:color w:val="000000"/>
+                <w:sz w:val="40"/>
+                <w:szCs w:val="40"/>
+                <w:lang w:bidi="ml-IN"/>
+              </w:rPr>
+              <w:t xml:space="preserve"> ||</w:t>
+            </w:r>
+          </w:p>
+        </w:tc>
+      </w:tr>
+      <w:tr>
+        <w:trPr>
+          <w:trHeight w:val="822"/>
+        </w:trPr>
+        <w:tc>
+          <w:tcPr>
+            <w:tcW w:w="3906" w:type="dxa"/>
+            <w:tcBorders>
+              <w:top w:val="single" w:sz="4" w:space="0" w:color="000000"/>
+              <w:left w:val="single" w:sz="4" w:space="0" w:color="000000"/>
+              <w:bottom w:val="single" w:sz="4" w:space="0" w:color="000000"/>
+              <w:right w:val="single" w:sz="4" w:space="0" w:color="000000"/>
+            </w:tcBorders>
+          </w:tcPr>
+          <w:p>
+            <w:pPr>
+              <w:widowControl w:val="0"/>
+              <w:tabs>
+                <w:tab w:val="left" w:pos="993"/>
+              </w:tabs>
+              <w:autoSpaceDE w:val="0"/>
+              <w:autoSpaceDN w:val="0"/>
+              <w:adjustRightInd w:val="0"/>
+              <w:spacing w:before="0" w:line="252" w:lineRule="auto"/>
+              <w:ind w:right="297"/>
+              <w:rPr>
+                <w:rFonts w:cs="Arial"/>
+                <w:b/>
+                <w:sz w:val="28"/>
+                <w:szCs w:val="32"/>
+              </w:rPr>
+            </w:pPr>
+            <w:r>
+              <w:rPr>
+                <w:rFonts w:cs="Latha"/>
+                <w:b/>
+                <w:sz w:val="28"/>
+                <w:szCs w:val="28"/>
+                <w:lang w:bidi="ta-IN"/>
+              </w:rPr>
+              <w:t>TS 4.7.1</w:t>
+            </w:r>
+            <w:r>
+              <w:rPr>
+                <w:rFonts w:cs="Latha"/>
+                <w:b/>
+                <w:sz w:val="28"/>
+                <w:szCs w:val="28"/>
+                <w:lang w:bidi="ta-IN"/>
+              </w:rPr>
+              <w:t>5.2</w:t>
+            </w:r>
+            <w:r>
+              <w:rPr>
+                <w:rFonts w:cs="Latha"/>
+                <w:b/>
+                <w:sz w:val="28"/>
+                <w:szCs w:val="28"/>
+                <w:lang w:bidi="ta-IN"/>
+              </w:rPr>
+              <w:t xml:space="preserve">- </w:t>
+            </w:r>
+            <w:r>
+              <w:rPr>
+                <w:rFonts w:cs="Arial"/>
+                <w:b/>
+                <w:sz w:val="28"/>
+                <w:szCs w:val="32"/>
+              </w:rPr>
+              <w:t>Kramam</w:t>
+            </w:r>
+          </w:p>
+          <w:p>
+            <w:pPr>
+              <w:spacing w:before="0" w:line="240" w:lineRule="auto"/>
+              <w:rPr>
+                <w:rFonts w:cs="Latha"/>
+                <w:b/>
+                <w:sz w:val="28"/>
+                <w:szCs w:val="28"/>
+                <w:lang w:val="en-IN" w:bidi="ta-IN"/>
+              </w:rPr>
+            </w:pPr>
+            <w:r>
+              <w:rPr>
+                <w:rFonts w:cs="Arial"/>
+                <w:b/>
+                <w:sz w:val="28"/>
+                <w:szCs w:val="32"/>
+                <w:lang w:val="en-IN"/>
+              </w:rPr>
+              <w:t>Krama Vaakyam</w:t>
+            </w:r>
+            <w:r>
+              <w:rPr>
+                <w:rFonts w:cs="Latha"/>
+                <w:b/>
+                <w:sz w:val="28"/>
+                <w:szCs w:val="28"/>
+                <w:lang w:val="en-IN" w:bidi="ta-IN"/>
+              </w:rPr>
+              <w:t xml:space="preserve"> No: - </w:t>
+            </w:r>
+            <w:r>
+              <w:rPr>
+                <w:rFonts w:cs="Latha"/>
+                <w:b/>
+                <w:sz w:val="28"/>
+                <w:szCs w:val="28"/>
+                <w:lang w:val="en-IN" w:bidi="ta-IN"/>
+              </w:rPr>
+              <w:t>5</w:t>
+            </w:r>
+            <w:r>
+              <w:rPr>
+                <w:rFonts w:cs="Latha"/>
+                <w:b/>
+                <w:sz w:val="28"/>
+                <w:szCs w:val="28"/>
+                <w:lang w:val="en-IN" w:bidi="ta-IN"/>
+              </w:rPr>
+              <w:t>7</w:t>
+            </w:r>
+          </w:p>
+          <w:p>
+            <w:pPr>
+              <w:widowControl w:val="0"/>
+              <w:tabs>
+                <w:tab w:val="left" w:pos="993"/>
+              </w:tabs>
+              <w:autoSpaceDE w:val="0"/>
+              <w:autoSpaceDN w:val="0"/>
+              <w:adjustRightInd w:val="0"/>
+              <w:spacing w:before="0" w:line="252" w:lineRule="auto"/>
+              <w:ind w:right="297"/>
+              <w:rPr>
+                <w:rFonts w:cs="Latha"/>
+                <w:b/>
+                <w:sz w:val="28"/>
+                <w:szCs w:val="28"/>
+                <w:lang w:bidi="ta-IN"/>
+              </w:rPr>
+            </w:pPr>
+            <w:r>
+              <w:rPr>
+                <w:rFonts w:cs="Latha"/>
+                <w:b/>
+                <w:sz w:val="28"/>
+                <w:szCs w:val="28"/>
+                <w:lang w:val="it-IT" w:bidi="ta-IN"/>
+              </w:rPr>
+              <w:t xml:space="preserve">Panchaati No. - </w:t>
+            </w:r>
+            <w:r>
+              <w:rPr>
+                <w:rFonts w:cs="Latha"/>
+                <w:b/>
+                <w:sz w:val="28"/>
+                <w:szCs w:val="28"/>
+                <w:lang w:val="it-IT" w:bidi="ta-IN"/>
+              </w:rPr>
+              <w:t>34</w:t>
+            </w:r>
+          </w:p>
+        </w:tc>
+        <w:tc>
+          <w:tcPr>
+            <w:tcW w:w="5103" w:type="dxa"/>
+            <w:tcBorders>
+              <w:top w:val="single" w:sz="4" w:space="0" w:color="000000"/>
+              <w:left w:val="single" w:sz="4" w:space="0" w:color="000000"/>
+              <w:bottom w:val="single" w:sz="4" w:space="0" w:color="000000"/>
+              <w:right w:val="single" w:sz="4" w:space="0" w:color="000000"/>
+            </w:tcBorders>
+          </w:tcPr>
+          <w:p>
+            <w:pPr>
+              <w:widowControl w:val="0"/>
+              <w:autoSpaceDE w:val="0"/>
+              <w:autoSpaceDN w:val="0"/>
+              <w:adjustRightInd w:val="0"/>
+              <w:spacing w:line="252" w:lineRule="auto"/>
+              <w:rPr>
+                <w:rFonts w:ascii="BRH Devanagari Extra" w:hAnsi="BRH Devanagari Extra" w:cs="BRH Devanagari Extra"/>
+                <w:color w:val="000000"/>
+                <w:sz w:val="40"/>
+                <w:szCs w:val="40"/>
+                <w:lang w:bidi="ml-IN"/>
+              </w:rPr>
+            </w:pPr>
+            <w:r>
+              <w:rPr>
+                <w:rFonts w:ascii="BRH Devanagari Extra" w:hAnsi="BRH Devanagari Extra" w:cs="BRH Devanagari Extra"/>
+                <w:color w:val="000000"/>
+                <w:sz w:val="40"/>
+                <w:szCs w:val="40"/>
+                <w:lang w:bidi="ml-IN"/>
+              </w:rPr>
+              <w:t>SÕ</w:t>
+            </w:r>
+            <w:r>
+              <w:rPr>
+                <w:rFonts w:ascii="BRH Tamil Tab Extra" w:hAnsi="BRH Tamil Tab Extra" w:cs="BRH Devanagari Extra"/>
+                <w:color w:val="000000"/>
+                <w:sz w:val="32"/>
+                <w:szCs w:val="40"/>
+                <w:lang w:bidi="ml-IN"/>
+              </w:rPr>
+              <w:t>…</w:t>
+            </w:r>
+            <w:r>
+              <w:rPr>
+                <w:rFonts w:ascii="BRH Devanagari Extra" w:hAnsi="BRH Devanagari Extra" w:cs="BRH Devanagari Extra"/>
+                <w:color w:val="000000"/>
+                <w:sz w:val="40"/>
+                <w:szCs w:val="40"/>
+                <w:lang w:bidi="ml-IN"/>
+              </w:rPr>
+              <w:t>wÉ</w:t>
+            </w:r>
+            <w:r>
+              <w:rPr>
+                <w:rFonts w:ascii="BRH Devanagari Extra" w:hAnsi="BRH Devanagari Extra" w:cs="BRH Devanagari Extra"/>
+                <w:color w:val="000000"/>
+                <w:sz w:val="40"/>
+                <w:szCs w:val="40"/>
+                <w:highlight w:val="yellow"/>
+                <w:lang w:bidi="ml-IN"/>
+              </w:rPr>
+              <w:t>rÉÍ</w:t>
+            </w:r>
+            <w:r>
+              <w:rPr>
+                <w:rFonts w:ascii="BRH Devanagari Extra" w:hAnsi="BRH Devanagari Extra" w:cs="BRH Devanagari Extra"/>
+                <w:color w:val="000000"/>
+                <w:sz w:val="40"/>
+                <w:szCs w:val="40"/>
+                <w:lang w:bidi="ml-IN"/>
+              </w:rPr>
+              <w:t>³ÉÌiÉþ SÕ</w:t>
+            </w:r>
+            <w:r>
+              <w:rPr>
+                <w:rFonts w:ascii="BRH Tamil Tab Extra" w:hAnsi="BRH Tamil Tab Extra" w:cs="BRH Devanagari Extra"/>
+                <w:color w:val="000000"/>
+                <w:sz w:val="32"/>
+                <w:szCs w:val="40"/>
+                <w:lang w:bidi="ml-IN"/>
+              </w:rPr>
+              <w:t>…</w:t>
+            </w:r>
+            <w:r>
+              <w:rPr>
+                <w:rFonts w:ascii="BRH Devanagari Extra" w:hAnsi="BRH Devanagari Extra" w:cs="BRH Devanagari Extra"/>
+                <w:color w:val="000000"/>
+                <w:sz w:val="40"/>
+                <w:szCs w:val="40"/>
+                <w:lang w:bidi="ml-IN"/>
+              </w:rPr>
+              <w:t xml:space="preserve">wÉrÉ³Éçþ || </w:t>
+            </w:r>
+          </w:p>
+          <w:p>
+            <w:pPr>
+              <w:spacing w:before="0" w:line="240" w:lineRule="auto"/>
+              <w:rPr>
+                <w:rFonts w:ascii="Latha" w:hAnsi="Latha" w:cs="Latha"/>
+                <w:sz w:val="28"/>
+                <w:szCs w:val="28"/>
+                <w:cs/>
+                <w:lang w:bidi="ta-IN"/>
+              </w:rPr>
+            </w:pPr>
+          </w:p>
+        </w:tc>
+        <w:tc>
+          <w:tcPr>
+            <w:tcW w:w="5386" w:type="dxa"/>
+            <w:tcBorders>
+              <w:top w:val="single" w:sz="4" w:space="0" w:color="000000"/>
+              <w:left w:val="single" w:sz="4" w:space="0" w:color="000000"/>
+              <w:bottom w:val="single" w:sz="4" w:space="0" w:color="000000"/>
+              <w:right w:val="single" w:sz="4" w:space="0" w:color="000000"/>
+            </w:tcBorders>
+          </w:tcPr>
+          <w:p>
+            <w:pPr>
+              <w:widowControl w:val="0"/>
+              <w:autoSpaceDE w:val="0"/>
+              <w:autoSpaceDN w:val="0"/>
+              <w:adjustRightInd w:val="0"/>
+              <w:spacing w:line="252" w:lineRule="auto"/>
+              <w:rPr>
+                <w:rFonts w:ascii="BRH Devanagari Extra" w:hAnsi="BRH Devanagari Extra" w:cs="BRH Devanagari Extra"/>
+                <w:color w:val="000000"/>
+                <w:sz w:val="40"/>
+                <w:szCs w:val="40"/>
+                <w:lang w:bidi="ml-IN"/>
+              </w:rPr>
+            </w:pPr>
+            <w:r>
+              <w:rPr>
+                <w:rFonts w:ascii="BRH Devanagari Extra" w:hAnsi="BRH Devanagari Extra" w:cs="BRH Devanagari Extra"/>
+                <w:color w:val="000000"/>
+                <w:sz w:val="40"/>
+                <w:szCs w:val="40"/>
+                <w:lang w:bidi="ml-IN"/>
+              </w:rPr>
+              <w:t>SÕ</w:t>
+            </w:r>
+            <w:r>
+              <w:rPr>
+                <w:rFonts w:ascii="BRH Tamil Tab Extra" w:hAnsi="BRH Tamil Tab Extra" w:cs="BRH Devanagari Extra"/>
+                <w:color w:val="000000"/>
+                <w:sz w:val="32"/>
+                <w:szCs w:val="40"/>
+                <w:lang w:bidi="ml-IN"/>
+              </w:rPr>
+              <w:t>…</w:t>
+            </w:r>
+            <w:proofErr w:type="spellStart"/>
+            <w:r>
+              <w:rPr>
+                <w:rFonts w:ascii="BRH Devanagari Extra" w:hAnsi="BRH Devanagari Extra" w:cs="BRH Devanagari Extra"/>
+                <w:color w:val="000000"/>
+                <w:sz w:val="40"/>
+                <w:szCs w:val="40"/>
+                <w:lang w:bidi="ml-IN"/>
+              </w:rPr>
+              <w:t>wÉ</w:t>
+            </w:r>
+            <w:r>
+              <w:rPr>
+                <w:rFonts w:ascii="BRH Devanagari Extra" w:hAnsi="BRH Devanagari Extra" w:cs="BRH Devanagari Extra"/>
+                <w:color w:val="000000"/>
+                <w:sz w:val="40"/>
+                <w:szCs w:val="40"/>
+                <w:highlight w:val="green"/>
+                <w:lang w:bidi="ml-IN"/>
+              </w:rPr>
+              <w:t>rÉ</w:t>
+            </w:r>
+            <w:proofErr w:type="spellEnd"/>
+            <w:r>
+              <w:rPr>
+                <w:rFonts w:ascii="BRH Tamil Tab Extra" w:hAnsi="BRH Tamil Tab Extra" w:cs="BRH Devanagari Extra"/>
+                <w:color w:val="000000"/>
+                <w:sz w:val="32"/>
+                <w:szCs w:val="40"/>
+                <w:highlight w:val="green"/>
+                <w:lang w:bidi="ml-IN"/>
+              </w:rPr>
+              <w:t>…</w:t>
+            </w:r>
+            <w:r>
+              <w:rPr>
+                <w:rFonts w:ascii="BRH Devanagari Extra" w:hAnsi="BRH Devanagari Extra" w:cs="BRH Devanagari Extra"/>
+                <w:color w:val="000000"/>
+                <w:sz w:val="40"/>
+                <w:szCs w:val="40"/>
+                <w:highlight w:val="green"/>
+                <w:lang w:bidi="ml-IN"/>
+              </w:rPr>
+              <w:t>Í</w:t>
+            </w:r>
+            <w:r>
+              <w:rPr>
+                <w:rFonts w:ascii="BRH Devanagari Extra" w:hAnsi="BRH Devanagari Extra" w:cs="BRH Devanagari Extra"/>
+                <w:color w:val="000000"/>
+                <w:sz w:val="40"/>
+                <w:szCs w:val="40"/>
+                <w:lang w:bidi="ml-IN"/>
+              </w:rPr>
+              <w:t>³ÉÌiÉþ SÕ</w:t>
+            </w:r>
+            <w:r>
+              <w:rPr>
+                <w:rFonts w:ascii="BRH Tamil Tab Extra" w:hAnsi="BRH Tamil Tab Extra" w:cs="BRH Devanagari Extra"/>
+                <w:color w:val="000000"/>
+                <w:sz w:val="32"/>
+                <w:szCs w:val="40"/>
+                <w:lang w:bidi="ml-IN"/>
+              </w:rPr>
+              <w:t>…</w:t>
+            </w:r>
+            <w:r>
+              <w:rPr>
+                <w:rFonts w:ascii="BRH Devanagari Extra" w:hAnsi="BRH Devanagari Extra" w:cs="BRH Devanagari Extra"/>
+                <w:color w:val="000000"/>
+                <w:sz w:val="40"/>
+                <w:szCs w:val="40"/>
+                <w:lang w:bidi="ml-IN"/>
+              </w:rPr>
+              <w:t xml:space="preserve">wÉrÉ³Éçþ || </w:t>
+            </w:r>
+          </w:p>
+          <w:p>
+            <w:pPr>
+              <w:spacing w:before="0" w:line="240" w:lineRule="auto"/>
+              <w:rPr>
+                <w:rFonts w:ascii="Latha" w:hAnsi="Latha" w:cs="Latha"/>
+                <w:sz w:val="28"/>
+                <w:szCs w:val="28"/>
+                <w:cs/>
+                <w:lang w:bidi="ta-IN"/>
+              </w:rPr>
+            </w:pPr>
           </w:p>
         </w:tc>
       </w:tr>
@@ -1381,6 +2340,7 @@
           <w:szCs w:val="32"/>
           <w:u w:val="single"/>
         </w:rPr>
+        <w:lastRenderedPageBreak/>
         <w:t xml:space="preserve">TS </w:t>
       </w:r>
       <w:r>
@@ -1500,12 +2460,16 @@
               <w:spacing w:before="0" w:line="240" w:lineRule="auto"/>
               <w:jc w:val="center"/>
               <w:rPr>
-                <w:sz w:val="32"/>
-                <w:szCs w:val="32"/>
-              </w:rPr>
-            </w:pPr>
-            <w:r>
-              <w:rPr>
+                <w:b/>
+                <w:bCs/>
+                <w:sz w:val="32"/>
+                <w:szCs w:val="32"/>
+              </w:rPr>
+            </w:pPr>
+            <w:r>
+              <w:rPr>
+                <w:b/>
+                <w:bCs/>
                 <w:sz w:val="32"/>
                 <w:szCs w:val="32"/>
               </w:rPr>
@@ -1517,12 +2481,16 @@
               <w:spacing w:before="0" w:line="240" w:lineRule="auto"/>
               <w:jc w:val="center"/>
               <w:rPr>
-                <w:sz w:val="32"/>
-                <w:szCs w:val="32"/>
-              </w:rPr>
-            </w:pPr>
-            <w:r>
-              <w:rPr>
+                <w:b/>
+                <w:bCs/>
+                <w:sz w:val="32"/>
+                <w:szCs w:val="32"/>
+              </w:rPr>
+            </w:pPr>
+            <w:r>
+              <w:rPr>
+                <w:b/>
+                <w:bCs/>
                 <w:sz w:val="32"/>
                 <w:szCs w:val="32"/>
               </w:rPr>
@@ -1539,12 +2507,16 @@
               <w:spacing w:before="0" w:line="240" w:lineRule="auto"/>
               <w:jc w:val="center"/>
               <w:rPr>
-                <w:sz w:val="32"/>
-                <w:szCs w:val="32"/>
-              </w:rPr>
-            </w:pPr>
-            <w:r>
-              <w:rPr>
+                <w:b/>
+                <w:bCs/>
+                <w:sz w:val="32"/>
+                <w:szCs w:val="32"/>
+              </w:rPr>
+            </w:pPr>
+            <w:r>
+              <w:rPr>
+                <w:b/>
+                <w:bCs/>
                 <w:sz w:val="32"/>
                 <w:szCs w:val="32"/>
               </w:rPr>
@@ -1562,12 +2534,16 @@
               <w:ind w:right="-18"/>
               <w:jc w:val="center"/>
               <w:rPr>
-                <w:sz w:val="32"/>
-                <w:szCs w:val="32"/>
-              </w:rPr>
-            </w:pPr>
-            <w:r>
-              <w:rPr>
+                <w:b/>
+                <w:bCs/>
+                <w:sz w:val="32"/>
+                <w:szCs w:val="32"/>
+              </w:rPr>
+            </w:pPr>
+            <w:r>
+              <w:rPr>
+                <w:b/>
+                <w:bCs/>
                 <w:sz w:val="32"/>
                 <w:szCs w:val="32"/>
               </w:rPr>
@@ -1779,7 +2755,18 @@
                 <w:szCs w:val="40"/>
                 <w:lang w:bidi="ml-IN"/>
               </w:rPr>
-              <w:t>Í³ÉÌiÉþ UÉeÉ</w:t>
+              <w:t xml:space="preserve">Í³ÉÌiÉþ </w:t>
+            </w:r>
+            <w:proofErr w:type="spellStart"/>
+            <w:r>
+              <w:rPr>
+                <w:rFonts w:ascii="BRH Devanagari Extra" w:hAnsi="BRH Devanagari Extra" w:cs="BRH Devanagari Extra"/>
+                <w:color w:val="000000"/>
+                <w:sz w:val="40"/>
+                <w:szCs w:val="40"/>
+                <w:lang w:bidi="ml-IN"/>
+              </w:rPr>
+              <w:t>UÉeÉ</w:t>
             </w:r>
             <w:r>
               <w:rPr>
@@ -1792,6 +2779,7 @@
               </w:rPr>
               <w:t>lÉç</w:t>
             </w:r>
+            <w:proofErr w:type="spellEnd"/>
             <w:r>
               <w:rPr>
                 <w:rFonts w:ascii="BRH Devanagari Extra" w:hAnsi="BRH Devanagari Extra" w:cs="BRH Devanagari Extra"/>
@@ -1937,7 +2925,6 @@
                 <w:szCs w:val="28"/>
                 <w:lang w:bidi="ta-IN"/>
               </w:rPr>
-              <w:lastRenderedPageBreak/>
               <w:t>TS 4.7.</w:t>
             </w:r>
             <w:r>
@@ -2063,6 +3050,7 @@
                 <w:szCs w:val="40"/>
               </w:rPr>
             </w:pPr>
+            <w:proofErr w:type="spellStart"/>
             <w:r>
               <w:rPr>
                 <w:rFonts w:ascii="BRH Devanagari Extra" w:hAnsi="BRH Devanagari Extra" w:cs="BRH Devanagari Extra"/>
@@ -2074,15 +3062,60 @@
               </w:rPr>
               <w:t>M×ükÉÏþ</w:t>
             </w:r>
-            <w:r>
-              <w:rPr>
-                <w:rFonts w:ascii="BRH Devanagari Extra" w:hAnsi="BRH Devanagari Extra" w:cs="BRH Devanagari Extra"/>
-                <w:color w:val="000000"/>
-                <w:sz w:val="40"/>
-                <w:szCs w:val="40"/>
-                <w:lang w:bidi="ml-IN"/>
-              </w:rPr>
-              <w:t xml:space="preserve"> xÉÑ | xuÉþxqÉÉlÉç |</w:t>
+            <w:proofErr w:type="spellEnd"/>
+            <w:r>
+              <w:rPr>
+                <w:rFonts w:ascii="BRH Devanagari Extra" w:hAnsi="BRH Devanagari Extra" w:cs="BRH Devanagari Extra"/>
+                <w:color w:val="000000"/>
+                <w:sz w:val="40"/>
+                <w:szCs w:val="40"/>
+                <w:lang w:bidi="ml-IN"/>
+              </w:rPr>
+              <w:t xml:space="preserve"> </w:t>
+            </w:r>
+            <w:proofErr w:type="spellStart"/>
+            <w:r>
+              <w:rPr>
+                <w:rFonts w:ascii="BRH Devanagari Extra" w:hAnsi="BRH Devanagari Extra" w:cs="BRH Devanagari Extra"/>
+                <w:color w:val="000000"/>
+                <w:sz w:val="40"/>
+                <w:szCs w:val="40"/>
+                <w:lang w:bidi="ml-IN"/>
+              </w:rPr>
+              <w:t>xÉÑ</w:t>
+            </w:r>
+            <w:proofErr w:type="spellEnd"/>
+            <w:r>
+              <w:rPr>
+                <w:rFonts w:ascii="BRH Devanagari Extra" w:hAnsi="BRH Devanagari Extra" w:cs="BRH Devanagari Extra"/>
+                <w:color w:val="000000"/>
+                <w:sz w:val="40"/>
+                <w:szCs w:val="40"/>
+                <w:lang w:bidi="ml-IN"/>
+              </w:rPr>
+              <w:t xml:space="preserve"> | </w:t>
+            </w:r>
+            <w:proofErr w:type="spellStart"/>
+            <w:r>
+              <w:rPr>
+                <w:rFonts w:ascii="BRH Devanagari Extra" w:hAnsi="BRH Devanagari Extra" w:cs="BRH Devanagari Extra"/>
+                <w:color w:val="000000"/>
+                <w:sz w:val="40"/>
+                <w:szCs w:val="40"/>
+                <w:lang w:bidi="ml-IN"/>
+              </w:rPr>
+              <w:t>xuÉþxqÉÉlÉç</w:t>
+            </w:r>
+            <w:proofErr w:type="spellEnd"/>
+            <w:r>
+              <w:rPr>
+                <w:rFonts w:ascii="BRH Devanagari Extra" w:hAnsi="BRH Devanagari Extra" w:cs="BRH Devanagari Extra"/>
+                <w:color w:val="000000"/>
+                <w:sz w:val="40"/>
+                <w:szCs w:val="40"/>
+                <w:lang w:bidi="ml-IN"/>
+              </w:rPr>
+              <w:t xml:space="preserve"> |</w:t>
             </w:r>
           </w:p>
         </w:tc>
@@ -2105,6 +3138,7 @@
                 <w:szCs w:val="40"/>
               </w:rPr>
             </w:pPr>
+            <w:proofErr w:type="spellStart"/>
             <w:r>
               <w:rPr>
                 <w:rFonts w:ascii="BRH Devanagari Extra" w:hAnsi="BRH Devanagari Extra" w:cs="BRH Devanagari Extra"/>
@@ -2116,6 +3150,7 @@
               </w:rPr>
               <w:t>M×ü</w:t>
             </w:r>
+            <w:proofErr w:type="spellEnd"/>
             <w:r>
               <w:rPr>
                 <w:rFonts w:ascii="BRH Tamil Tab Extra" w:hAnsi="BRH Tamil Tab Extra" w:cs="BRH Devanagari Extra"/>
@@ -2127,6 +3162,7 @@
               </w:rPr>
               <w:t>…</w:t>
             </w:r>
+            <w:proofErr w:type="spellStart"/>
             <w:r>
               <w:rPr>
                 <w:rFonts w:ascii="BRH Devanagari Extra" w:hAnsi="BRH Devanagari Extra" w:cs="BRH Devanagari Extra"/>
@@ -2138,15 +3174,60 @@
               </w:rPr>
               <w:t>kÉÏ</w:t>
             </w:r>
-            <w:r>
-              <w:rPr>
-                <w:rFonts w:ascii="BRH Devanagari Extra" w:hAnsi="BRH Devanagari Extra" w:cs="BRH Devanagari Extra"/>
-                <w:color w:val="000000"/>
-                <w:sz w:val="40"/>
-                <w:szCs w:val="40"/>
-                <w:lang w:bidi="ml-IN"/>
-              </w:rPr>
-              <w:t xml:space="preserve"> xÉÑ | xuÉþxqÉÉlÉç |</w:t>
+            <w:proofErr w:type="spellEnd"/>
+            <w:r>
+              <w:rPr>
+                <w:rFonts w:ascii="BRH Devanagari Extra" w:hAnsi="BRH Devanagari Extra" w:cs="BRH Devanagari Extra"/>
+                <w:color w:val="000000"/>
+                <w:sz w:val="40"/>
+                <w:szCs w:val="40"/>
+                <w:lang w:bidi="ml-IN"/>
+              </w:rPr>
+              <w:t xml:space="preserve"> </w:t>
+            </w:r>
+            <w:proofErr w:type="spellStart"/>
+            <w:r>
+              <w:rPr>
+                <w:rFonts w:ascii="BRH Devanagari Extra" w:hAnsi="BRH Devanagari Extra" w:cs="BRH Devanagari Extra"/>
+                <w:color w:val="000000"/>
+                <w:sz w:val="40"/>
+                <w:szCs w:val="40"/>
+                <w:lang w:bidi="ml-IN"/>
+              </w:rPr>
+              <w:t>xÉÑ</w:t>
+            </w:r>
+            <w:proofErr w:type="spellEnd"/>
+            <w:r>
+              <w:rPr>
+                <w:rFonts w:ascii="BRH Devanagari Extra" w:hAnsi="BRH Devanagari Extra" w:cs="BRH Devanagari Extra"/>
+                <w:color w:val="000000"/>
+                <w:sz w:val="40"/>
+                <w:szCs w:val="40"/>
+                <w:lang w:bidi="ml-IN"/>
+              </w:rPr>
+              <w:t xml:space="preserve"> | </w:t>
+            </w:r>
+            <w:proofErr w:type="spellStart"/>
+            <w:r>
+              <w:rPr>
+                <w:rFonts w:ascii="BRH Devanagari Extra" w:hAnsi="BRH Devanagari Extra" w:cs="BRH Devanagari Extra"/>
+                <w:color w:val="000000"/>
+                <w:sz w:val="40"/>
+                <w:szCs w:val="40"/>
+                <w:lang w:bidi="ml-IN"/>
+              </w:rPr>
+              <w:t>xuÉþxqÉÉlÉç</w:t>
+            </w:r>
+            <w:proofErr w:type="spellEnd"/>
+            <w:r>
+              <w:rPr>
+                <w:rFonts w:ascii="BRH Devanagari Extra" w:hAnsi="BRH Devanagari Extra" w:cs="BRH Devanagari Extra"/>
+                <w:color w:val="000000"/>
+                <w:sz w:val="40"/>
+                <w:szCs w:val="40"/>
+                <w:lang w:bidi="ml-IN"/>
+              </w:rPr>
+              <w:t xml:space="preserve"> |</w:t>
             </w:r>
           </w:p>
         </w:tc>
@@ -2571,7 +3652,18 @@
                 <w:szCs w:val="40"/>
                 <w:lang w:bidi="ml-IN"/>
               </w:rPr>
-              <w:t xml:space="preserve"> qÉ</w:t>
+              <w:t xml:space="preserve"> </w:t>
+            </w:r>
+            <w:proofErr w:type="spellStart"/>
+            <w:r>
+              <w:rPr>
+                <w:rFonts w:ascii="BRH Devanagari Extra" w:hAnsi="BRH Devanagari Extra" w:cs="BRH Devanagari Extra"/>
+                <w:color w:val="000000"/>
+                <w:sz w:val="40"/>
+                <w:szCs w:val="40"/>
+                <w:lang w:bidi="ml-IN"/>
+              </w:rPr>
+              <w:t>qÉ</w:t>
             </w:r>
             <w:r>
               <w:rPr>
@@ -2583,6 +3675,7 @@
               </w:rPr>
               <w:t>å</w:t>
             </w:r>
+            <w:proofErr w:type="spellEnd"/>
             <w:r>
               <w:rPr>
                 <w:rFonts w:ascii="BRH Tamil Tab Extra" w:hAnsi="BRH Tamil Tab Extra" w:cs="BRH Devanagari Extra"/>
@@ -2603,6 +3696,7 @@
               </w:rPr>
               <w:t xml:space="preserve"> | </w:t>
             </w:r>
+            <w:proofErr w:type="spellStart"/>
             <w:r>
               <w:rPr>
                 <w:rFonts w:ascii="BRH Devanagari Extra" w:hAnsi="BRH Devanagari Extra" w:cs="BRH Devanagari Extra"/>
@@ -2614,6 +3708,7 @@
               </w:rPr>
               <w:t>qÉå</w:t>
             </w:r>
+            <w:proofErr w:type="spellEnd"/>
             <w:r>
               <w:rPr>
                 <w:rFonts w:ascii="BRH Devanagari Extra" w:hAnsi="BRH Devanagari Extra" w:cs="BRH Devanagari Extra"/>
@@ -2634,15 +3729,27 @@
               </w:rPr>
               <w:t>…</w:t>
             </w:r>
-            <w:r>
-              <w:rPr>
-                <w:rFonts w:ascii="BRH Devanagari Extra" w:hAnsi="BRH Devanagari Extra" w:cs="BRH Devanagari Extra"/>
-                <w:color w:val="000000"/>
-                <w:sz w:val="40"/>
-                <w:szCs w:val="40"/>
-                <w:lang w:bidi="ml-IN"/>
-              </w:rPr>
-              <w:t>lÉÔÈ |</w:t>
+            <w:proofErr w:type="spellStart"/>
+            <w:r>
+              <w:rPr>
+                <w:rFonts w:ascii="BRH Devanagari Extra" w:hAnsi="BRH Devanagari Extra" w:cs="BRH Devanagari Extra"/>
+                <w:color w:val="000000"/>
+                <w:sz w:val="40"/>
+                <w:szCs w:val="40"/>
+                <w:lang w:bidi="ml-IN"/>
+              </w:rPr>
+              <w:t>lÉÔÈ</w:t>
+            </w:r>
+            <w:proofErr w:type="spellEnd"/>
+            <w:r>
+              <w:rPr>
+                <w:rFonts w:ascii="BRH Devanagari Extra" w:hAnsi="BRH Devanagari Extra" w:cs="BRH Devanagari Extra"/>
+                <w:color w:val="000000"/>
+                <w:sz w:val="40"/>
+                <w:szCs w:val="40"/>
+                <w:lang w:bidi="ml-IN"/>
+              </w:rPr>
+              <w:t xml:space="preserve"> |</w:t>
             </w:r>
           </w:p>
         </w:tc>
@@ -2693,7 +3800,18 @@
                 <w:szCs w:val="40"/>
                 <w:lang w:bidi="ml-IN"/>
               </w:rPr>
-              <w:t xml:space="preserve"> qÉ</w:t>
+              <w:t xml:space="preserve"> </w:t>
+            </w:r>
+            <w:proofErr w:type="spellStart"/>
+            <w:r>
+              <w:rPr>
+                <w:rFonts w:ascii="BRH Devanagari Extra" w:hAnsi="BRH Devanagari Extra" w:cs="BRH Devanagari Extra"/>
+                <w:color w:val="000000"/>
+                <w:sz w:val="40"/>
+                <w:szCs w:val="40"/>
+                <w:lang w:bidi="ml-IN"/>
+              </w:rPr>
+              <w:t>qÉ</w:t>
             </w:r>
             <w:r>
               <w:rPr>
@@ -2705,6 +3823,7 @@
               </w:rPr>
               <w:t>å</w:t>
             </w:r>
+            <w:proofErr w:type="spellEnd"/>
             <w:r>
               <w:rPr>
                 <w:rFonts w:ascii="BRH Tamil Tab Extra" w:hAnsi="BRH Tamil Tab Extra" w:cs="BRH Devanagari Extra"/>
@@ -2725,6 +3844,7 @@
               </w:rPr>
               <w:t xml:space="preserve"> | </w:t>
             </w:r>
+            <w:proofErr w:type="spellStart"/>
             <w:r>
               <w:rPr>
                 <w:rFonts w:ascii="BRH Devanagari Extra" w:hAnsi="BRH Devanagari Extra" w:cs="BRH Devanagari Extra"/>
@@ -2736,6 +3856,7 @@
               </w:rPr>
               <w:t>qÉå</w:t>
             </w:r>
+            <w:proofErr w:type="spellEnd"/>
             <w:r>
               <w:rPr>
                 <w:rFonts w:ascii="BRH Tamil Tab Extra" w:hAnsi="BRH Tamil Tab Extra" w:cs="BRH Devanagari Extra"/>
@@ -2767,15 +3888,27 @@
               </w:rPr>
               <w:t>…</w:t>
             </w:r>
-            <w:r>
-              <w:rPr>
-                <w:rFonts w:ascii="BRH Devanagari Extra" w:hAnsi="BRH Devanagari Extra" w:cs="BRH Devanagari Extra"/>
-                <w:color w:val="000000"/>
-                <w:sz w:val="40"/>
-                <w:szCs w:val="40"/>
-                <w:lang w:bidi="ml-IN"/>
-              </w:rPr>
-              <w:t>lÉÔÈ |</w:t>
+            <w:proofErr w:type="spellStart"/>
+            <w:r>
+              <w:rPr>
+                <w:rFonts w:ascii="BRH Devanagari Extra" w:hAnsi="BRH Devanagari Extra" w:cs="BRH Devanagari Extra"/>
+                <w:color w:val="000000"/>
+                <w:sz w:val="40"/>
+                <w:szCs w:val="40"/>
+                <w:lang w:bidi="ml-IN"/>
+              </w:rPr>
+              <w:t>lÉÔÈ</w:t>
+            </w:r>
+            <w:proofErr w:type="spellEnd"/>
+            <w:r>
+              <w:rPr>
+                <w:rFonts w:ascii="BRH Devanagari Extra" w:hAnsi="BRH Devanagari Extra" w:cs="BRH Devanagari Extra"/>
+                <w:color w:val="000000"/>
+                <w:sz w:val="40"/>
+                <w:szCs w:val="40"/>
+                <w:lang w:bidi="ml-IN"/>
+              </w:rPr>
+              <w:t xml:space="preserve"> |</w:t>
             </w:r>
           </w:p>
         </w:tc>
@@ -2909,6 +4042,7 @@
                 <w:lang w:bidi="ml-IN"/>
               </w:rPr>
             </w:pPr>
+            <w:proofErr w:type="spellStart"/>
             <w:r>
               <w:rPr>
                 <w:rFonts w:ascii="BRH Devanagari Extra" w:hAnsi="BRH Devanagari Extra" w:cs="BRH Devanagari Extra"/>
@@ -2919,6 +4053,7 @@
               </w:rPr>
               <w:t>ÌmÉ</w:t>
             </w:r>
+            <w:proofErr w:type="spellEnd"/>
             <w:r>
               <w:rPr>
                 <w:rFonts w:ascii="BRH Tamil Tab Extra" w:hAnsi="BRH Tamil Tab Extra" w:cs="BRH Devanagari Extra"/>
@@ -2977,8 +4112,20 @@
                 <w:szCs w:val="40"/>
                 <w:lang w:bidi="ml-IN"/>
               </w:rPr>
-              <w:t xml:space="preserve"> qÉÉ</w:t>
-            </w:r>
+              <w:t xml:space="preserve"> </w:t>
+            </w:r>
+            <w:proofErr w:type="spellStart"/>
+            <w:r>
+              <w:rPr>
+                <w:rFonts w:ascii="BRH Devanagari Extra" w:hAnsi="BRH Devanagari Extra" w:cs="BRH Devanagari Extra"/>
+                <w:color w:val="000000"/>
+                <w:sz w:val="40"/>
+                <w:szCs w:val="40"/>
+                <w:lang w:bidi="ml-IN"/>
+              </w:rPr>
+              <w:t>qÉÉ</w:t>
+            </w:r>
+            <w:proofErr w:type="spellEnd"/>
             <w:r>
               <w:rPr>
                 <w:rFonts w:ascii="BRH Tamil Tab Extra" w:hAnsi="BRH Tamil Tab Extra" w:cs="BRH Devanagari Extra"/>
@@ -2989,6 +4136,7 @@
               </w:rPr>
               <w:t>…</w:t>
             </w:r>
+            <w:proofErr w:type="spellStart"/>
             <w:r>
               <w:rPr>
                 <w:rFonts w:ascii="BRH Devanagari Extra" w:hAnsi="BRH Devanagari Extra" w:cs="BRH Devanagari Extra"/>
@@ -2999,6 +4147,7 @@
               </w:rPr>
               <w:t>SrÉþ</w:t>
             </w:r>
+            <w:proofErr w:type="spellEnd"/>
             <w:r>
               <w:rPr>
                 <w:rFonts w:ascii="BRH Devanagari Extra" w:eastAsia="Times New Roman" w:hAnsi="BRH Devanagari Extra" w:cs="BRH Devanagari Extra"/>
@@ -3009,6 +4158,7 @@
               </w:rPr>
               <w:t>S</w:t>
             </w:r>
+            <w:proofErr w:type="spellStart"/>
             <w:r>
               <w:rPr>
                 <w:rFonts w:ascii="BRH Devanagari Extra" w:hAnsi="BRH Devanagari Extra" w:cs="BRH Devanagari Extra"/>
@@ -3027,7 +4177,18 @@
                 <w:szCs w:val="40"/>
                 <w:lang w:bidi="ml-IN"/>
               </w:rPr>
-              <w:t xml:space="preserve">kuÉqÉç | </w:t>
+              <w:t>kuÉqÉç</w:t>
+            </w:r>
+            <w:proofErr w:type="spellEnd"/>
+            <w:r>
+              <w:rPr>
+                <w:rFonts w:ascii="BRH Devanagari Extra" w:hAnsi="BRH Devanagari Extra" w:cs="BRH Devanagari Extra"/>
+                <w:color w:val="000000"/>
+                <w:sz w:val="40"/>
+                <w:szCs w:val="40"/>
+                <w:lang w:bidi="ml-IN"/>
+              </w:rPr>
+              <w:t xml:space="preserve"> | </w:t>
             </w:r>
           </w:p>
           <w:p>
@@ -3048,6 +4209,7 @@
                 <w:lang w:val="en-IN" w:eastAsia="en-IN" w:bidi="ml-IN"/>
               </w:rPr>
             </w:pPr>
+            <w:proofErr w:type="spellStart"/>
             <w:r>
               <w:rPr>
                 <w:rFonts w:ascii="BRH Devanagari Extra" w:hAnsi="BRH Devanagari Extra" w:cs="BRH Devanagari Extra"/>
@@ -3058,6 +4220,7 @@
               </w:rPr>
               <w:t>qÉÉ</w:t>
             </w:r>
+            <w:proofErr w:type="spellEnd"/>
             <w:r>
               <w:rPr>
                 <w:rFonts w:ascii="BRH Tamil Tab Extra" w:hAnsi="BRH Tamil Tab Extra" w:cs="BRH Devanagari Extra"/>
@@ -3109,15 +4272,27 @@
               </w:rPr>
               <w:t>…</w:t>
             </w:r>
-            <w:r>
-              <w:rPr>
-                <w:rFonts w:ascii="BRH Devanagari Extra" w:hAnsi="BRH Devanagari Extra" w:cs="BRH Devanagari Extra"/>
-                <w:color w:val="000000"/>
-                <w:sz w:val="40"/>
-                <w:szCs w:val="40"/>
-                <w:lang w:bidi="ml-IN"/>
-              </w:rPr>
-              <w:t>miÉÉÈ |</w:t>
+            <w:proofErr w:type="spellStart"/>
+            <w:r>
+              <w:rPr>
+                <w:rFonts w:ascii="BRH Devanagari Extra" w:hAnsi="BRH Devanagari Extra" w:cs="BRH Devanagari Extra"/>
+                <w:color w:val="000000"/>
+                <w:sz w:val="40"/>
+                <w:szCs w:val="40"/>
+                <w:lang w:bidi="ml-IN"/>
+              </w:rPr>
+              <w:t>miÉÉÈ</w:t>
+            </w:r>
+            <w:proofErr w:type="spellEnd"/>
+            <w:r>
+              <w:rPr>
+                <w:rFonts w:ascii="BRH Devanagari Extra" w:hAnsi="BRH Devanagari Extra" w:cs="BRH Devanagari Extra"/>
+                <w:color w:val="000000"/>
+                <w:sz w:val="40"/>
+                <w:szCs w:val="40"/>
+                <w:lang w:bidi="ml-IN"/>
+              </w:rPr>
+              <w:t xml:space="preserve"> |</w:t>
             </w:r>
           </w:p>
         </w:tc>
@@ -3143,6 +4318,7 @@
                 <w:lang w:bidi="ml-IN"/>
               </w:rPr>
             </w:pPr>
+            <w:proofErr w:type="spellStart"/>
             <w:r>
               <w:rPr>
                 <w:rFonts w:ascii="BRH Devanagari Extra" w:hAnsi="BRH Devanagari Extra" w:cs="BRH Devanagari Extra"/>
@@ -3153,6 +4329,7 @@
               </w:rPr>
               <w:t>ÌmÉ</w:t>
             </w:r>
+            <w:proofErr w:type="spellEnd"/>
             <w:r>
               <w:rPr>
                 <w:rFonts w:ascii="BRH Tamil Tab Extra" w:hAnsi="BRH Tamil Tab Extra" w:cs="BRH Devanagari Extra"/>
@@ -3211,8 +4388,20 @@
                 <w:szCs w:val="40"/>
                 <w:lang w:bidi="ml-IN"/>
               </w:rPr>
-              <w:t xml:space="preserve"> qÉÉ</w:t>
-            </w:r>
+              <w:t xml:space="preserve"> </w:t>
+            </w:r>
+            <w:proofErr w:type="spellStart"/>
+            <w:r>
+              <w:rPr>
+                <w:rFonts w:ascii="BRH Devanagari Extra" w:hAnsi="BRH Devanagari Extra" w:cs="BRH Devanagari Extra"/>
+                <w:color w:val="000000"/>
+                <w:sz w:val="40"/>
+                <w:szCs w:val="40"/>
+                <w:lang w:bidi="ml-IN"/>
+              </w:rPr>
+              <w:t>qÉÉ</w:t>
+            </w:r>
+            <w:proofErr w:type="spellEnd"/>
             <w:r>
               <w:rPr>
                 <w:rFonts w:ascii="BRH Tamil Tab Extra" w:hAnsi="BRH Tamil Tab Extra" w:cs="BRH Devanagari Extra"/>
@@ -3223,6 +4412,7 @@
               </w:rPr>
               <w:t>…</w:t>
             </w:r>
+            <w:proofErr w:type="spellStart"/>
             <w:r>
               <w:rPr>
                 <w:rFonts w:ascii="BRH Devanagari Extra" w:hAnsi="BRH Devanagari Extra" w:cs="BRH Devanagari Extra"/>
@@ -3233,6 +4423,7 @@
               </w:rPr>
               <w:t>SrÉþ</w:t>
             </w:r>
+            <w:proofErr w:type="spellEnd"/>
             <w:r>
               <w:rPr>
                 <w:rFonts w:ascii="BRH Devanagari Extra" w:eastAsia="Times New Roman" w:hAnsi="BRH Devanagari Extra" w:cs="BRH Devanagari Extra"/>
@@ -3243,6 +4434,7 @@
               </w:rPr>
               <w:t>S</w:t>
             </w:r>
+            <w:proofErr w:type="spellStart"/>
             <w:r>
               <w:rPr>
                 <w:rFonts w:ascii="BRH Devanagari Extra" w:hAnsi="BRH Devanagari Extra" w:cs="BRH Devanagari Extra"/>
@@ -3261,7 +4453,18 @@
                 <w:szCs w:val="40"/>
                 <w:lang w:bidi="ml-IN"/>
               </w:rPr>
-              <w:t xml:space="preserve">kuÉqÉç | </w:t>
+              <w:t>kuÉqÉç</w:t>
+            </w:r>
+            <w:proofErr w:type="spellEnd"/>
+            <w:r>
+              <w:rPr>
+                <w:rFonts w:ascii="BRH Devanagari Extra" w:hAnsi="BRH Devanagari Extra" w:cs="BRH Devanagari Extra"/>
+                <w:color w:val="000000"/>
+                <w:sz w:val="40"/>
+                <w:szCs w:val="40"/>
+                <w:lang w:bidi="ml-IN"/>
+              </w:rPr>
+              <w:t xml:space="preserve"> | </w:t>
             </w:r>
           </w:p>
           <w:p>
@@ -3282,6 +4485,7 @@
                 <w:lang w:val="en-IN" w:eastAsia="en-IN" w:bidi="ml-IN"/>
               </w:rPr>
             </w:pPr>
+            <w:proofErr w:type="spellStart"/>
             <w:r>
               <w:rPr>
                 <w:rFonts w:ascii="BRH Devanagari Extra" w:hAnsi="BRH Devanagari Extra" w:cs="BRH Devanagari Extra"/>
@@ -3292,6 +4496,7 @@
               </w:rPr>
               <w:t>qÉÉ</w:t>
             </w:r>
+            <w:proofErr w:type="spellEnd"/>
             <w:r>
               <w:rPr>
                 <w:rFonts w:ascii="BRH Tamil Tab Extra" w:hAnsi="BRH Tamil Tab Extra" w:cs="BRH Devanagari Extra"/>
@@ -3302,6 +4507,7 @@
               </w:rPr>
               <w:t>…</w:t>
             </w:r>
+            <w:proofErr w:type="spellStart"/>
             <w:r>
               <w:rPr>
                 <w:rFonts w:ascii="BRH Devanagari Extra" w:hAnsi="BRH Devanagari Extra" w:cs="BRH Devanagari Extra"/>
@@ -3312,6 +4518,7 @@
               </w:rPr>
               <w:t>SrÉþ</w:t>
             </w:r>
+            <w:proofErr w:type="spellEnd"/>
             <w:r>
               <w:rPr>
                 <w:rFonts w:ascii="BRH Devanagari Extra" w:eastAsia="Times New Roman" w:hAnsi="BRH Devanagari Extra" w:cs="BRH Devanagari Extra"/>
@@ -3323,6 +4530,7 @@
               </w:rPr>
               <w:t>S</w:t>
             </w:r>
+            <w:proofErr w:type="spellStart"/>
             <w:r>
               <w:rPr>
                 <w:rFonts w:ascii="BRH Devanagari Extra" w:hAnsi="BRH Devanagari Extra" w:cs="BRH Devanagari Extra"/>
@@ -3342,7 +4550,18 @@
                 <w:szCs w:val="40"/>
                 <w:lang w:bidi="ml-IN"/>
               </w:rPr>
-              <w:t>ç iÉ×</w:t>
+              <w:t>ç</w:t>
+            </w:r>
+            <w:proofErr w:type="spellEnd"/>
+            <w:r>
+              <w:rPr>
+                <w:rFonts w:ascii="BRH Devanagari Extra" w:hAnsi="BRH Devanagari Extra" w:cs="BRH Devanagari Extra"/>
+                <w:color w:val="000000"/>
+                <w:sz w:val="40"/>
+                <w:szCs w:val="40"/>
+                <w:lang w:bidi="ml-IN"/>
+              </w:rPr>
+              <w:t xml:space="preserve"> iÉ×</w:t>
             </w:r>
             <w:r>
               <w:rPr>
@@ -3354,15 +4573,27 @@
               </w:rPr>
               <w:t>…</w:t>
             </w:r>
-            <w:r>
-              <w:rPr>
-                <w:rFonts w:ascii="BRH Devanagari Extra" w:hAnsi="BRH Devanagari Extra" w:cs="BRH Devanagari Extra"/>
-                <w:color w:val="000000"/>
-                <w:sz w:val="40"/>
-                <w:szCs w:val="40"/>
-                <w:lang w:bidi="ml-IN"/>
-              </w:rPr>
-              <w:t>miÉÉÈ |</w:t>
+            <w:proofErr w:type="spellStart"/>
+            <w:r>
+              <w:rPr>
+                <w:rFonts w:ascii="BRH Devanagari Extra" w:hAnsi="BRH Devanagari Extra" w:cs="BRH Devanagari Extra"/>
+                <w:color w:val="000000"/>
+                <w:sz w:val="40"/>
+                <w:szCs w:val="40"/>
+                <w:lang w:bidi="ml-IN"/>
+              </w:rPr>
+              <w:t>miÉÉÈ</w:t>
+            </w:r>
+            <w:proofErr w:type="spellEnd"/>
+            <w:r>
+              <w:rPr>
+                <w:rFonts w:ascii="BRH Devanagari Extra" w:hAnsi="BRH Devanagari Extra" w:cs="BRH Devanagari Extra"/>
+                <w:color w:val="000000"/>
+                <w:sz w:val="40"/>
+                <w:szCs w:val="40"/>
+                <w:lang w:bidi="ml-IN"/>
+              </w:rPr>
+              <w:t xml:space="preserve"> |</w:t>
             </w:r>
           </w:p>
         </w:tc>
@@ -3401,6 +4632,7 @@
                 <w:szCs w:val="28"/>
                 <w:lang w:bidi="ta-IN"/>
               </w:rPr>
+              <w:lastRenderedPageBreak/>
               <w:t xml:space="preserve">TS 4.7.12.2 - </w:t>
             </w:r>
             <w:r>
@@ -3524,7 +4756,18 @@
                 <w:szCs w:val="40"/>
                 <w:lang w:bidi="ml-IN"/>
               </w:rPr>
-              <w:t xml:space="preserve"> ÌuÉ</w:t>
+              <w:t xml:space="preserve"> </w:t>
+            </w:r>
+            <w:proofErr w:type="spellStart"/>
+            <w:r>
+              <w:rPr>
+                <w:rFonts w:ascii="BRH Devanagari Extra" w:hAnsi="BRH Devanagari Extra" w:cs="BRH Devanagari Extra"/>
+                <w:color w:val="000000"/>
+                <w:sz w:val="40"/>
+                <w:szCs w:val="40"/>
+                <w:lang w:bidi="ml-IN"/>
+              </w:rPr>
+              <w:t>ÌuÉ</w:t>
             </w:r>
             <w:r>
               <w:rPr>
@@ -3545,7 +4788,18 @@
                 <w:szCs w:val="40"/>
                 <w:lang w:bidi="ml-IN"/>
               </w:rPr>
-              <w:t>ÿ |</w:t>
+              <w:t>ÿ</w:t>
+            </w:r>
+            <w:proofErr w:type="spellEnd"/>
+            <w:r>
+              <w:rPr>
+                <w:rFonts w:ascii="BRH Devanagari Extra" w:hAnsi="BRH Devanagari Extra" w:cs="BRH Devanagari Extra"/>
+                <w:color w:val="000000"/>
+                <w:sz w:val="40"/>
+                <w:szCs w:val="40"/>
+                <w:lang w:bidi="ml-IN"/>
+              </w:rPr>
+              <w:t xml:space="preserve"> |</w:t>
             </w:r>
           </w:p>
         </w:tc>
@@ -3599,7 +4853,18 @@
                 <w:szCs w:val="40"/>
                 <w:lang w:bidi="ml-IN"/>
               </w:rPr>
-              <w:t xml:space="preserve"> ÌuÉ</w:t>
+              <w:t xml:space="preserve"> </w:t>
+            </w:r>
+            <w:proofErr w:type="spellStart"/>
+            <w:r>
+              <w:rPr>
+                <w:rFonts w:ascii="BRH Devanagari Extra" w:hAnsi="BRH Devanagari Extra" w:cs="BRH Devanagari Extra"/>
+                <w:color w:val="000000"/>
+                <w:sz w:val="40"/>
+                <w:szCs w:val="40"/>
+                <w:lang w:bidi="ml-IN"/>
+              </w:rPr>
+              <w:t>ÌuÉ</w:t>
             </w:r>
             <w:r>
               <w:rPr>
@@ -3612,6 +4877,7 @@
               </w:rPr>
               <w:t>µÉÉÿÈ</w:t>
             </w:r>
+            <w:proofErr w:type="spellEnd"/>
             <w:r>
               <w:rPr>
                 <w:rFonts w:ascii="BRH Devanagari Extra" w:hAnsi="BRH Devanagari Extra" w:cs="BRH Devanagari Extra"/>
@@ -3627,8 +4893,17 @@
                 <w:b/>
                 <w:bCs/>
               </w:rPr>
-              <w:t>(visargam</w:t>
-            </w:r>
+              <w:t>(</w:t>
+            </w:r>
+            <w:proofErr w:type="spellStart"/>
+            <w:r>
+              <w:rPr>
+                <w:b/>
+                <w:bCs/>
+              </w:rPr>
+              <w:t>visargam</w:t>
+            </w:r>
+            <w:proofErr w:type="spellEnd"/>
             <w:r>
               <w:rPr>
                 <w:rFonts w:ascii="Cambria" w:eastAsia="Times New Roman" w:hAnsi="Cambria" w:cs="BRH Malayalam Extra"/>
@@ -3786,6 +5061,7 @@
                 <w:lang w:bidi="ml-IN"/>
               </w:rPr>
             </w:pPr>
+            <w:proofErr w:type="spellStart"/>
             <w:r>
               <w:rPr>
                 <w:rFonts w:ascii="BRH Devanagari Extra" w:hAnsi="BRH Devanagari Extra" w:cs="BRH Devanagari Extra"/>
@@ -3796,6 +5072,7 @@
               </w:rPr>
               <w:t>kÉÉ</w:t>
             </w:r>
+            <w:proofErr w:type="spellEnd"/>
             <w:r>
               <w:rPr>
                 <w:rFonts w:ascii="BRH Tamil Tab Extra" w:hAnsi="BRH Tamil Tab Extra" w:cs="BRH Devanagari Extra"/>
@@ -3806,6 +5083,7 @@
               </w:rPr>
               <w:t>…</w:t>
             </w:r>
+            <w:proofErr w:type="spellStart"/>
             <w:r>
               <w:rPr>
                 <w:rFonts w:ascii="BRH Devanagari Extra" w:hAnsi="BRH Devanagari Extra" w:cs="BRH Devanagari Extra"/>
@@ -3846,6 +5124,7 @@
               </w:rPr>
               <w:t>å</w:t>
             </w:r>
+            <w:proofErr w:type="spellEnd"/>
             <w:r>
               <w:rPr>
                 <w:rFonts w:ascii="BRH Tamil Tab Extra" w:hAnsi="BRH Tamil Tab Extra" w:cs="BRH Devanagari Extra"/>
@@ -3864,7 +5143,29 @@
                 <w:szCs w:val="40"/>
                 <w:lang w:bidi="ml-IN"/>
               </w:rPr>
-              <w:t xml:space="preserve"> ÍzÉzÉÑÿqÉç | </w:t>
+              <w:t xml:space="preserve"> </w:t>
+            </w:r>
+            <w:proofErr w:type="spellStart"/>
+            <w:r>
+              <w:rPr>
+                <w:rFonts w:ascii="BRH Devanagari Extra" w:hAnsi="BRH Devanagari Extra" w:cs="BRH Devanagari Extra"/>
+                <w:color w:val="000000"/>
+                <w:sz w:val="40"/>
+                <w:szCs w:val="40"/>
+                <w:lang w:bidi="ml-IN"/>
+              </w:rPr>
+              <w:t>ÍzÉzÉÑÿqÉç</w:t>
+            </w:r>
+            <w:proofErr w:type="spellEnd"/>
+            <w:r>
+              <w:rPr>
+                <w:rFonts w:ascii="BRH Devanagari Extra" w:hAnsi="BRH Devanagari Extra" w:cs="BRH Devanagari Extra"/>
+                <w:color w:val="000000"/>
+                <w:sz w:val="40"/>
+                <w:szCs w:val="40"/>
+                <w:lang w:bidi="ml-IN"/>
+              </w:rPr>
+              <w:t xml:space="preserve"> | </w:t>
             </w:r>
           </w:p>
           <w:p>
@@ -3882,6 +5183,7 @@
                 <w:lang w:bidi="ml-IN"/>
               </w:rPr>
             </w:pPr>
+            <w:proofErr w:type="spellStart"/>
             <w:r>
               <w:rPr>
                 <w:rFonts w:ascii="BRH Devanagari Extra" w:hAnsi="BRH Devanagari Extra" w:cs="BRH Devanagari Extra"/>
@@ -3892,6 +5194,7 @@
               </w:rPr>
               <w:t>kÉÉ</w:t>
             </w:r>
+            <w:proofErr w:type="spellEnd"/>
             <w:r>
               <w:rPr>
                 <w:rFonts w:ascii="BRH Tamil Tab Extra" w:hAnsi="BRH Tamil Tab Extra" w:cs="BRH Devanagari Extra"/>
@@ -3903,6 +5206,7 @@
               </w:rPr>
               <w:t>…</w:t>
             </w:r>
+            <w:proofErr w:type="spellStart"/>
             <w:r>
               <w:rPr>
                 <w:rFonts w:ascii="BRH Devanagari Extra" w:hAnsi="BRH Devanagari Extra" w:cs="BRH Devanagari Extra"/>
@@ -3954,6 +5258,7 @@
               </w:rPr>
               <w:t>å</w:t>
             </w:r>
+            <w:proofErr w:type="spellEnd"/>
             <w:r>
               <w:rPr>
                 <w:rFonts w:ascii="BRH Tamil Tab Extra" w:hAnsi="BRH Tamil Tab Extra" w:cs="BRH Devanagari Extra"/>
@@ -3972,8 +5277,42 @@
                 <w:szCs w:val="40"/>
                 <w:lang w:bidi="ml-IN"/>
               </w:rPr>
-              <w:t xml:space="preserve"> CÌiÉþ kÉÉ</w:t>
-            </w:r>
+              <w:t xml:space="preserve"> </w:t>
+            </w:r>
+            <w:proofErr w:type="spellStart"/>
+            <w:r>
+              <w:rPr>
+                <w:rFonts w:ascii="BRH Devanagari Extra" w:hAnsi="BRH Devanagari Extra" w:cs="BRH Devanagari Extra"/>
+                <w:color w:val="000000"/>
+                <w:sz w:val="40"/>
+                <w:szCs w:val="40"/>
+                <w:lang w:bidi="ml-IN"/>
+              </w:rPr>
+              <w:t>CÌiÉþ</w:t>
+            </w:r>
+            <w:proofErr w:type="spellEnd"/>
+            <w:r>
+              <w:rPr>
+                <w:rFonts w:ascii="BRH Devanagari Extra" w:hAnsi="BRH Devanagari Extra" w:cs="BRH Devanagari Extra"/>
+                <w:color w:val="000000"/>
+                <w:sz w:val="40"/>
+                <w:szCs w:val="40"/>
+                <w:lang w:bidi="ml-IN"/>
+              </w:rPr>
+              <w:t xml:space="preserve"> </w:t>
+            </w:r>
+            <w:proofErr w:type="spellStart"/>
+            <w:r>
+              <w:rPr>
+                <w:rFonts w:ascii="BRH Devanagari Extra" w:hAnsi="BRH Devanagari Extra" w:cs="BRH Devanagari Extra"/>
+                <w:color w:val="000000"/>
+                <w:sz w:val="40"/>
+                <w:szCs w:val="40"/>
+                <w:lang w:bidi="ml-IN"/>
+              </w:rPr>
+              <w:t>kÉÉ</w:t>
+            </w:r>
+            <w:proofErr w:type="spellEnd"/>
             <w:r>
               <w:rPr>
                 <w:rFonts w:ascii="BRH Tamil Tab Extra" w:hAnsi="BRH Tamil Tab Extra" w:cs="BRH Devanagari Extra"/>
@@ -3984,6 +5323,7 @@
               </w:rPr>
               <w:t>…</w:t>
             </w:r>
+            <w:proofErr w:type="spellStart"/>
             <w:r>
               <w:rPr>
                 <w:rFonts w:ascii="BRH Devanagari Extra" w:hAnsi="BRH Devanagari Extra" w:cs="BRH Devanagari Extra"/>
@@ -4024,6 +5364,7 @@
               </w:rPr>
               <w:t>å</w:t>
             </w:r>
+            <w:proofErr w:type="spellEnd"/>
             <w:r>
               <w:rPr>
                 <w:rFonts w:ascii="BRH Devanagari Extra" w:hAnsi="BRH Devanagari Extra" w:cs="BRH Devanagari Extra"/>
@@ -4055,6 +5396,7 @@
                 <w:lang w:bidi="ml-IN"/>
               </w:rPr>
             </w:pPr>
+            <w:proofErr w:type="spellStart"/>
             <w:r>
               <w:rPr>
                 <w:rFonts w:ascii="BRH Devanagari Extra" w:hAnsi="BRH Devanagari Extra" w:cs="BRH Devanagari Extra"/>
@@ -4065,6 +5407,7 @@
               </w:rPr>
               <w:t>kÉÉ</w:t>
             </w:r>
+            <w:proofErr w:type="spellEnd"/>
             <w:r>
               <w:rPr>
                 <w:rFonts w:ascii="BRH Tamil Tab Extra" w:hAnsi="BRH Tamil Tab Extra" w:cs="BRH Devanagari Extra"/>
@@ -4075,6 +5418,7 @@
               </w:rPr>
               <w:t>…</w:t>
             </w:r>
+            <w:proofErr w:type="spellStart"/>
             <w:r>
               <w:rPr>
                 <w:rFonts w:ascii="BRH Devanagari Extra" w:hAnsi="BRH Devanagari Extra" w:cs="BRH Devanagari Extra"/>
@@ -4115,6 +5459,7 @@
               </w:rPr>
               <w:t>å</w:t>
             </w:r>
+            <w:proofErr w:type="spellEnd"/>
             <w:r>
               <w:rPr>
                 <w:rFonts w:ascii="BRH Tamil Tab Extra" w:hAnsi="BRH Tamil Tab Extra" w:cs="BRH Devanagari Extra"/>
@@ -4133,7 +5478,29 @@
                 <w:szCs w:val="40"/>
                 <w:lang w:bidi="ml-IN"/>
               </w:rPr>
-              <w:t xml:space="preserve"> ÍzÉzÉÑÿqÉç | </w:t>
+              <w:t xml:space="preserve"> </w:t>
+            </w:r>
+            <w:proofErr w:type="spellStart"/>
+            <w:r>
+              <w:rPr>
+                <w:rFonts w:ascii="BRH Devanagari Extra" w:hAnsi="BRH Devanagari Extra" w:cs="BRH Devanagari Extra"/>
+                <w:color w:val="000000"/>
+                <w:sz w:val="40"/>
+                <w:szCs w:val="40"/>
+                <w:lang w:bidi="ml-IN"/>
+              </w:rPr>
+              <w:t>ÍzÉzÉÑÿqÉç</w:t>
+            </w:r>
+            <w:proofErr w:type="spellEnd"/>
+            <w:r>
+              <w:rPr>
+                <w:rFonts w:ascii="BRH Devanagari Extra" w:hAnsi="BRH Devanagari Extra" w:cs="BRH Devanagari Extra"/>
+                <w:color w:val="000000"/>
+                <w:sz w:val="40"/>
+                <w:szCs w:val="40"/>
+                <w:lang w:bidi="ml-IN"/>
+              </w:rPr>
+              <w:t xml:space="preserve"> | </w:t>
             </w:r>
           </w:p>
           <w:p>
@@ -4151,6 +5518,7 @@
                 <w:lang w:bidi="ml-IN"/>
               </w:rPr>
             </w:pPr>
+            <w:proofErr w:type="spellStart"/>
             <w:r>
               <w:rPr>
                 <w:rFonts w:ascii="BRH Devanagari Extra" w:hAnsi="BRH Devanagari Extra" w:cs="BRH Devanagari Extra"/>
@@ -4161,6 +5529,7 @@
               </w:rPr>
               <w:t>kÉÉ</w:t>
             </w:r>
+            <w:proofErr w:type="spellEnd"/>
             <w:r>
               <w:rPr>
                 <w:rFonts w:ascii="BRH Tamil Tab Extra" w:hAnsi="BRH Tamil Tab Extra" w:cs="BRH Devanagari Extra"/>
@@ -4171,6 +5540,7 @@
               </w:rPr>
               <w:t>…</w:t>
             </w:r>
+            <w:proofErr w:type="spellStart"/>
             <w:r>
               <w:rPr>
                 <w:rFonts w:ascii="BRH Devanagari Extra" w:hAnsi="BRH Devanagari Extra" w:cs="BRH Devanagari Extra"/>
@@ -4232,6 +5602,7 @@
               </w:rPr>
               <w:t>å</w:t>
             </w:r>
+            <w:proofErr w:type="spellEnd"/>
             <w:r>
               <w:rPr>
                 <w:rFonts w:ascii="BRH Tamil Tab Extra" w:hAnsi="BRH Tamil Tab Extra" w:cs="BRH Devanagari Extra"/>
@@ -4250,8 +5621,42 @@
                 <w:szCs w:val="40"/>
                 <w:lang w:bidi="ml-IN"/>
               </w:rPr>
-              <w:t xml:space="preserve"> CÌiÉþ kÉÉ</w:t>
-            </w:r>
+              <w:t xml:space="preserve"> </w:t>
+            </w:r>
+            <w:proofErr w:type="spellStart"/>
+            <w:r>
+              <w:rPr>
+                <w:rFonts w:ascii="BRH Devanagari Extra" w:hAnsi="BRH Devanagari Extra" w:cs="BRH Devanagari Extra"/>
+                <w:color w:val="000000"/>
+                <w:sz w:val="40"/>
+                <w:szCs w:val="40"/>
+                <w:lang w:bidi="ml-IN"/>
+              </w:rPr>
+              <w:t>CÌiÉþ</w:t>
+            </w:r>
+            <w:proofErr w:type="spellEnd"/>
+            <w:r>
+              <w:rPr>
+                <w:rFonts w:ascii="BRH Devanagari Extra" w:hAnsi="BRH Devanagari Extra" w:cs="BRH Devanagari Extra"/>
+                <w:color w:val="000000"/>
+                <w:sz w:val="40"/>
+                <w:szCs w:val="40"/>
+                <w:lang w:bidi="ml-IN"/>
+              </w:rPr>
+              <w:t xml:space="preserve"> </w:t>
+            </w:r>
+            <w:proofErr w:type="spellStart"/>
+            <w:r>
+              <w:rPr>
+                <w:rFonts w:ascii="BRH Devanagari Extra" w:hAnsi="BRH Devanagari Extra" w:cs="BRH Devanagari Extra"/>
+                <w:color w:val="000000"/>
+                <w:sz w:val="40"/>
+                <w:szCs w:val="40"/>
+                <w:lang w:bidi="ml-IN"/>
+              </w:rPr>
+              <w:t>kÉÉ</w:t>
+            </w:r>
+            <w:proofErr w:type="spellEnd"/>
             <w:r>
               <w:rPr>
                 <w:rFonts w:ascii="BRH Tamil Tab Extra" w:hAnsi="BRH Tamil Tab Extra" w:cs="BRH Devanagari Extra"/>
@@ -4262,6 +5667,7 @@
               </w:rPr>
               <w:t>…</w:t>
             </w:r>
+            <w:proofErr w:type="spellStart"/>
             <w:r>
               <w:rPr>
                 <w:rFonts w:ascii="BRH Devanagari Extra" w:hAnsi="BRH Devanagari Extra" w:cs="BRH Devanagari Extra"/>
@@ -4302,6 +5708,7 @@
               </w:rPr>
               <w:t>å</w:t>
             </w:r>
+            <w:proofErr w:type="spellEnd"/>
             <w:r>
               <w:rPr>
                 <w:rFonts w:ascii="BRH Devanagari Extra" w:hAnsi="BRH Devanagari Extra" w:cs="BRH Devanagari Extra"/>
@@ -4350,7 +5757,6 @@
                 <w:sz w:val="28"/>
                 <w:szCs w:val="32"/>
               </w:rPr>
-              <w:lastRenderedPageBreak/>
               <w:t>T.S.4.7.13.3 – Kramam</w:t>
             </w:r>
           </w:p>
@@ -4453,6 +5859,7 @@
                 <w:lang w:bidi="ml-IN"/>
               </w:rPr>
             </w:pPr>
+            <w:proofErr w:type="spellStart"/>
             <w:r>
               <w:rPr>
                 <w:rFonts w:ascii="BRH Devanagari Extra" w:hAnsi="BRH Devanagari Extra" w:cs="BRH Devanagari Extra"/>
@@ -4473,6 +5880,7 @@
               </w:rPr>
               <w:t>å</w:t>
             </w:r>
+            <w:proofErr w:type="spellEnd"/>
             <w:r>
               <w:rPr>
                 <w:rFonts w:ascii="BRH Tamil Tab Extra" w:hAnsi="BRH Tamil Tab Extra" w:cs="BRH Devanagari Extra"/>
@@ -4483,6 +5891,7 @@
               </w:rPr>
               <w:t>…</w:t>
             </w:r>
+            <w:proofErr w:type="spellStart"/>
             <w:r>
               <w:rPr>
                 <w:rFonts w:ascii="BRH Devanagari Extra" w:hAnsi="BRH Devanagari Extra" w:cs="BRH Devanagari Extra"/>
@@ -4493,6 +5902,7 @@
               </w:rPr>
               <w:t>uÉÉ</w:t>
             </w:r>
+            <w:proofErr w:type="spellEnd"/>
             <w:r>
               <w:rPr>
                 <w:rFonts w:ascii="BRH Tamil Tab Extra" w:hAnsi="BRH Tamil Tab Extra" w:cs="BRH Devanagari Extra"/>
@@ -4511,8 +5921,20 @@
                 <w:szCs w:val="40"/>
                 <w:lang w:bidi="ml-IN"/>
               </w:rPr>
-              <w:t>È mÉÑ</w:t>
-            </w:r>
+              <w:t xml:space="preserve">È </w:t>
+            </w:r>
+            <w:proofErr w:type="spellStart"/>
+            <w:r>
+              <w:rPr>
+                <w:rFonts w:ascii="BRH Devanagari Extra" w:hAnsi="BRH Devanagari Extra" w:cs="BRH Devanagari Extra"/>
+                <w:color w:val="000000"/>
+                <w:sz w:val="40"/>
+                <w:szCs w:val="40"/>
+                <w:lang w:bidi="ml-IN"/>
+              </w:rPr>
+              <w:t>mÉÑ</w:t>
+            </w:r>
+            <w:proofErr w:type="spellEnd"/>
             <w:r>
               <w:rPr>
                 <w:rFonts w:ascii="BRH Tamil Tab Extra" w:hAnsi="BRH Tamil Tab Extra" w:cs="BRH Devanagari Extra"/>
@@ -4533,18 +5955,53 @@
                 <w:highlight w:val="yellow"/>
                 <w:lang w:bidi="ml-IN"/>
               </w:rPr>
-              <w:t>§É</w:t>
-            </w:r>
-            <w:r>
-              <w:rPr>
-                <w:rFonts w:ascii="BRH Devanagari Extra" w:hAnsi="BRH Devanagari Extra" w:cs="BRH Devanagari Extra"/>
-                <w:color w:val="000000"/>
-                <w:sz w:val="40"/>
-                <w:szCs w:val="40"/>
-                <w:lang w:bidi="ml-IN"/>
-              </w:rPr>
-              <w:t>æ | mÉÑ</w:t>
-            </w:r>
+              <w:t>§</w:t>
+            </w:r>
+            <w:proofErr w:type="spellStart"/>
+            <w:r>
+              <w:rPr>
+                <w:rFonts w:ascii="BRH Devanagari Extra" w:hAnsi="BRH Devanagari Extra" w:cs="BRH Devanagari Extra"/>
+                <w:color w:val="000000"/>
+                <w:sz w:val="40"/>
+                <w:szCs w:val="40"/>
+                <w:highlight w:val="yellow"/>
+                <w:lang w:bidi="ml-IN"/>
+              </w:rPr>
+              <w:t>É</w:t>
+            </w:r>
+            <w:r>
+              <w:rPr>
+                <w:rFonts w:ascii="BRH Devanagari Extra" w:hAnsi="BRH Devanagari Extra" w:cs="BRH Devanagari Extra"/>
+                <w:color w:val="000000"/>
+                <w:sz w:val="40"/>
+                <w:szCs w:val="40"/>
+                <w:lang w:bidi="ml-IN"/>
+              </w:rPr>
+              <w:t>æ</w:t>
+            </w:r>
+            <w:proofErr w:type="spellEnd"/>
+            <w:r>
+              <w:rPr>
+                <w:rFonts w:ascii="BRH Devanagari Extra" w:hAnsi="BRH Devanagari Extra" w:cs="BRH Devanagari Extra"/>
+                <w:color w:val="000000"/>
+                <w:sz w:val="40"/>
+                <w:szCs w:val="40"/>
+                <w:lang w:bidi="ml-IN"/>
+              </w:rPr>
+              <w:t xml:space="preserve"> | </w:t>
+            </w:r>
+            <w:proofErr w:type="spellStart"/>
+            <w:r>
+              <w:rPr>
+                <w:rFonts w:ascii="BRH Devanagari Extra" w:hAnsi="BRH Devanagari Extra" w:cs="BRH Devanagari Extra"/>
+                <w:color w:val="000000"/>
+                <w:sz w:val="40"/>
+                <w:szCs w:val="40"/>
+                <w:lang w:bidi="ml-IN"/>
+              </w:rPr>
+              <w:t>mÉÑ</w:t>
+            </w:r>
+            <w:proofErr w:type="spellEnd"/>
             <w:r>
               <w:rPr>
                 <w:rFonts w:ascii="BRH Tamil Tab Extra" w:hAnsi="BRH Tamil Tab Extra" w:cs="BRH Devanagari Extra"/>
@@ -4563,7 +6020,51 @@
                 <w:szCs w:val="40"/>
                 <w:lang w:bidi="ml-IN"/>
               </w:rPr>
-              <w:t>§ÉæUç pÉëÉiÉ×þÍpÉÈ |</w:t>
+              <w:t>§</w:t>
+            </w:r>
+            <w:proofErr w:type="spellStart"/>
+            <w:r>
+              <w:rPr>
+                <w:rFonts w:ascii="BRH Devanagari Extra" w:hAnsi="BRH Devanagari Extra" w:cs="BRH Devanagari Extra"/>
+                <w:color w:val="000000"/>
+                <w:sz w:val="40"/>
+                <w:szCs w:val="40"/>
+                <w:lang w:bidi="ml-IN"/>
+              </w:rPr>
+              <w:t>ÉæUç</w:t>
+            </w:r>
+            <w:proofErr w:type="spellEnd"/>
+            <w:r>
+              <w:rPr>
+                <w:rFonts w:ascii="BRH Devanagari Extra" w:hAnsi="BRH Devanagari Extra" w:cs="BRH Devanagari Extra"/>
+                <w:color w:val="000000"/>
+                <w:sz w:val="40"/>
+                <w:szCs w:val="40"/>
+                <w:lang w:bidi="ml-IN"/>
+              </w:rPr>
+              <w:t xml:space="preserve"> </w:t>
+            </w:r>
+            <w:proofErr w:type="spellStart"/>
+            <w:r>
+              <w:rPr>
+                <w:rFonts w:ascii="BRH Devanagari Extra" w:hAnsi="BRH Devanagari Extra" w:cs="BRH Devanagari Extra"/>
+                <w:color w:val="000000"/>
+                <w:sz w:val="40"/>
+                <w:szCs w:val="40"/>
+                <w:lang w:bidi="ml-IN"/>
+              </w:rPr>
+              <w:t>pÉëÉiÉ×þÍpÉÈ</w:t>
+            </w:r>
+            <w:proofErr w:type="spellEnd"/>
+            <w:r>
+              <w:rPr>
+                <w:rFonts w:ascii="BRH Devanagari Extra" w:hAnsi="BRH Devanagari Extra" w:cs="BRH Devanagari Extra"/>
+                <w:color w:val="000000"/>
+                <w:sz w:val="40"/>
+                <w:szCs w:val="40"/>
+                <w:lang w:bidi="ml-IN"/>
+              </w:rPr>
+              <w:t xml:space="preserve"> |</w:t>
             </w:r>
           </w:p>
         </w:tc>
@@ -4586,6 +6087,7 @@
                 <w:lang w:bidi="ml-IN"/>
               </w:rPr>
             </w:pPr>
+            <w:proofErr w:type="spellStart"/>
             <w:r>
               <w:rPr>
                 <w:rFonts w:ascii="BRH Devanagari Extra" w:hAnsi="BRH Devanagari Extra" w:cs="BRH Devanagari Extra"/>
@@ -4606,6 +6108,7 @@
               </w:rPr>
               <w:t>å</w:t>
             </w:r>
+            <w:proofErr w:type="spellEnd"/>
             <w:r>
               <w:rPr>
                 <w:rFonts w:ascii="BRH Tamil Tab Extra" w:hAnsi="BRH Tamil Tab Extra" w:cs="BRH Devanagari Extra"/>
@@ -4616,6 +6119,7 @@
               </w:rPr>
               <w:t>…</w:t>
             </w:r>
+            <w:proofErr w:type="spellStart"/>
             <w:r>
               <w:rPr>
                 <w:rFonts w:ascii="BRH Devanagari Extra" w:hAnsi="BRH Devanagari Extra" w:cs="BRH Devanagari Extra"/>
@@ -4626,6 +6130,7 @@
               </w:rPr>
               <w:t>uÉÉ</w:t>
             </w:r>
+            <w:proofErr w:type="spellEnd"/>
             <w:r>
               <w:rPr>
                 <w:rFonts w:ascii="BRH Tamil Tab Extra" w:hAnsi="BRH Tamil Tab Extra" w:cs="BRH Devanagari Extra"/>
@@ -4644,8 +6149,20 @@
                 <w:szCs w:val="40"/>
                 <w:lang w:bidi="ml-IN"/>
               </w:rPr>
-              <w:t>È mÉÑ</w:t>
-            </w:r>
+              <w:t xml:space="preserve">È </w:t>
+            </w:r>
+            <w:proofErr w:type="spellStart"/>
+            <w:r>
+              <w:rPr>
+                <w:rFonts w:ascii="BRH Devanagari Extra" w:hAnsi="BRH Devanagari Extra" w:cs="BRH Devanagari Extra"/>
+                <w:color w:val="000000"/>
+                <w:sz w:val="40"/>
+                <w:szCs w:val="40"/>
+                <w:lang w:bidi="ml-IN"/>
+              </w:rPr>
+              <w:t>mÉÑ</w:t>
+            </w:r>
+            <w:proofErr w:type="spellEnd"/>
             <w:r>
               <w:rPr>
                 <w:rFonts w:ascii="BRH Tamil Tab Extra" w:hAnsi="BRH Tamil Tab Extra" w:cs="BRH Devanagari Extra"/>
@@ -4666,18 +6183,43 @@
                 <w:highlight w:val="green"/>
                 <w:lang w:bidi="ml-IN"/>
               </w:rPr>
-              <w:t>§ÉæÈ</w:t>
-            </w:r>
-            <w:r>
-              <w:rPr>
-                <w:rFonts w:ascii="BRH Devanagari Extra" w:hAnsi="BRH Devanagari Extra" w:cs="BRH Devanagari Extra"/>
-                <w:color w:val="000000"/>
-                <w:sz w:val="40"/>
-                <w:szCs w:val="40"/>
-                <w:lang w:bidi="ml-IN"/>
-              </w:rPr>
-              <w:t xml:space="preserve"> | mÉÑ</w:t>
-            </w:r>
+              <w:t>§</w:t>
+            </w:r>
+            <w:proofErr w:type="spellStart"/>
+            <w:r>
+              <w:rPr>
+                <w:rFonts w:ascii="BRH Devanagari Extra" w:hAnsi="BRH Devanagari Extra" w:cs="BRH Devanagari Extra"/>
+                <w:color w:val="000000"/>
+                <w:sz w:val="40"/>
+                <w:szCs w:val="40"/>
+                <w:highlight w:val="green"/>
+                <w:lang w:bidi="ml-IN"/>
+              </w:rPr>
+              <w:t>ÉæÈ</w:t>
+            </w:r>
+            <w:proofErr w:type="spellEnd"/>
+            <w:r>
+              <w:rPr>
+                <w:rFonts w:ascii="BRH Devanagari Extra" w:hAnsi="BRH Devanagari Extra" w:cs="BRH Devanagari Extra"/>
+                <w:color w:val="000000"/>
+                <w:sz w:val="40"/>
+                <w:szCs w:val="40"/>
+                <w:lang w:bidi="ml-IN"/>
+              </w:rPr>
+              <w:t xml:space="preserve"> | </w:t>
+            </w:r>
+            <w:proofErr w:type="spellStart"/>
+            <w:r>
+              <w:rPr>
+                <w:rFonts w:ascii="BRH Devanagari Extra" w:hAnsi="BRH Devanagari Extra" w:cs="BRH Devanagari Extra"/>
+                <w:color w:val="000000"/>
+                <w:sz w:val="40"/>
+                <w:szCs w:val="40"/>
+                <w:lang w:bidi="ml-IN"/>
+              </w:rPr>
+              <w:t>mÉÑ</w:t>
+            </w:r>
+            <w:proofErr w:type="spellEnd"/>
             <w:r>
               <w:rPr>
                 <w:rFonts w:ascii="BRH Tamil Tab Extra" w:hAnsi="BRH Tamil Tab Extra" w:cs="BRH Devanagari Extra"/>
@@ -4696,7 +6238,51 @@
                 <w:szCs w:val="40"/>
                 <w:lang w:bidi="ml-IN"/>
               </w:rPr>
-              <w:t>§ÉæUç pÉëÉiÉ×þÍpÉÈ |</w:t>
+              <w:t>§</w:t>
+            </w:r>
+            <w:proofErr w:type="spellStart"/>
+            <w:r>
+              <w:rPr>
+                <w:rFonts w:ascii="BRH Devanagari Extra" w:hAnsi="BRH Devanagari Extra" w:cs="BRH Devanagari Extra"/>
+                <w:color w:val="000000"/>
+                <w:sz w:val="40"/>
+                <w:szCs w:val="40"/>
+                <w:lang w:bidi="ml-IN"/>
+              </w:rPr>
+              <w:t>ÉæUç</w:t>
+            </w:r>
+            <w:proofErr w:type="spellEnd"/>
+            <w:r>
+              <w:rPr>
+                <w:rFonts w:ascii="BRH Devanagari Extra" w:hAnsi="BRH Devanagari Extra" w:cs="BRH Devanagari Extra"/>
+                <w:color w:val="000000"/>
+                <w:sz w:val="40"/>
+                <w:szCs w:val="40"/>
+                <w:lang w:bidi="ml-IN"/>
+              </w:rPr>
+              <w:t xml:space="preserve"> </w:t>
+            </w:r>
+            <w:proofErr w:type="spellStart"/>
+            <w:r>
+              <w:rPr>
+                <w:rFonts w:ascii="BRH Devanagari Extra" w:hAnsi="BRH Devanagari Extra" w:cs="BRH Devanagari Extra"/>
+                <w:color w:val="000000"/>
+                <w:sz w:val="40"/>
+                <w:szCs w:val="40"/>
+                <w:lang w:bidi="ml-IN"/>
+              </w:rPr>
+              <w:t>pÉëÉiÉ×þÍpÉÈ</w:t>
+            </w:r>
+            <w:proofErr w:type="spellEnd"/>
+            <w:r>
+              <w:rPr>
+                <w:rFonts w:ascii="BRH Devanagari Extra" w:hAnsi="BRH Devanagari Extra" w:cs="BRH Devanagari Extra"/>
+                <w:color w:val="000000"/>
+                <w:sz w:val="40"/>
+                <w:szCs w:val="40"/>
+                <w:lang w:bidi="ml-IN"/>
+              </w:rPr>
+              <w:t xml:space="preserve"> |</w:t>
             </w:r>
           </w:p>
         </w:tc>
@@ -4837,6 +6423,7 @@
                 <w:szCs w:val="40"/>
               </w:rPr>
             </w:pPr>
+            <w:proofErr w:type="spellStart"/>
             <w:r>
               <w:rPr>
                 <w:rFonts w:ascii="BRH Devanagari Extra" w:hAnsi="BRH Devanagari Extra" w:cs="BRH Devanagari Extra"/>
@@ -4847,6 +6434,7 @@
               </w:rPr>
               <w:t>cÉiÉþxÉë</w:t>
             </w:r>
+            <w:proofErr w:type="spellEnd"/>
             <w:r>
               <w:rPr>
                 <w:rFonts w:ascii="BRH Tamil Tab Extra" w:hAnsi="BRH Tamil Tab Extra" w:cs="BRH Devanagari Extra"/>
@@ -4857,16 +6445,29 @@
               </w:rPr>
               <w:t>…</w:t>
             </w:r>
-            <w:r>
-              <w:rPr>
-                <w:rFonts w:ascii="BRH Devanagari Extra" w:hAnsi="BRH Devanagari Extra" w:cs="BRH Devanagari Extra"/>
-                <w:color w:val="000000"/>
-                <w:sz w:val="40"/>
-                <w:szCs w:val="40"/>
-                <w:lang w:bidi="ml-IN"/>
-              </w:rPr>
-              <w:t xml:space="preserve">xiuÉrÉÉÿ | </w:t>
-            </w:r>
+            <w:proofErr w:type="spellStart"/>
+            <w:r>
+              <w:rPr>
+                <w:rFonts w:ascii="BRH Devanagari Extra" w:hAnsi="BRH Devanagari Extra" w:cs="BRH Devanagari Extra"/>
+                <w:color w:val="000000"/>
+                <w:sz w:val="40"/>
+                <w:szCs w:val="40"/>
+                <w:lang w:bidi="ml-IN"/>
+              </w:rPr>
+              <w:t>xiuÉrÉÉÿ</w:t>
+            </w:r>
+            <w:proofErr w:type="spellEnd"/>
+            <w:r>
+              <w:rPr>
+                <w:rFonts w:ascii="BRH Devanagari Extra" w:hAnsi="BRH Devanagari Extra" w:cs="BRH Devanagari Extra"/>
+                <w:color w:val="000000"/>
+                <w:sz w:val="40"/>
+                <w:szCs w:val="40"/>
+                <w:lang w:bidi="ml-IN"/>
+              </w:rPr>
+              <w:t xml:space="preserve"> | </w:t>
+            </w:r>
+            <w:proofErr w:type="spellStart"/>
             <w:r>
               <w:rPr>
                 <w:rFonts w:ascii="BRH Devanagari Extra" w:hAnsi="BRH Devanagari Extra" w:cs="BRH Devanagari Extra"/>
@@ -4878,6 +6479,7 @@
               </w:rPr>
               <w:t>iuÉ</w:t>
             </w:r>
+            <w:proofErr w:type="spellEnd"/>
             <w:r>
               <w:rPr>
                 <w:rFonts w:ascii="BRH Tamil Tab Extra" w:hAnsi="BRH Tamil Tab Extra" w:cs="BRH Devanagari Extra"/>
@@ -4888,15 +6490,27 @@
               </w:rPr>
               <w:t>…</w:t>
             </w:r>
-            <w:r>
-              <w:rPr>
-                <w:rFonts w:ascii="BRH Devanagari Extra" w:hAnsi="BRH Devanagari Extra" w:cs="BRH Devanagari Extra"/>
-                <w:color w:val="000000"/>
-                <w:sz w:val="40"/>
-                <w:szCs w:val="40"/>
-                <w:lang w:bidi="ml-IN"/>
-              </w:rPr>
-              <w:t>rÉÉÅSèkrÉþ¤ÉåhÉ |</w:t>
+            <w:proofErr w:type="spellStart"/>
+            <w:r>
+              <w:rPr>
+                <w:rFonts w:ascii="BRH Devanagari Extra" w:hAnsi="BRH Devanagari Extra" w:cs="BRH Devanagari Extra"/>
+                <w:color w:val="000000"/>
+                <w:sz w:val="40"/>
+                <w:szCs w:val="40"/>
+                <w:lang w:bidi="ml-IN"/>
+              </w:rPr>
+              <w:t>rÉÉÅSèkrÉþ¤ÉåhÉ</w:t>
+            </w:r>
+            <w:proofErr w:type="spellEnd"/>
+            <w:r>
+              <w:rPr>
+                <w:rFonts w:ascii="BRH Devanagari Extra" w:hAnsi="BRH Devanagari Extra" w:cs="BRH Devanagari Extra"/>
+                <w:color w:val="000000"/>
+                <w:sz w:val="40"/>
+                <w:szCs w:val="40"/>
+                <w:lang w:bidi="ml-IN"/>
+              </w:rPr>
+              <w:t xml:space="preserve"> |</w:t>
             </w:r>
           </w:p>
         </w:tc>
@@ -4918,6 +6532,7 @@
                 <w:szCs w:val="40"/>
               </w:rPr>
             </w:pPr>
+            <w:proofErr w:type="spellStart"/>
             <w:r>
               <w:rPr>
                 <w:rFonts w:ascii="BRH Devanagari Extra" w:hAnsi="BRH Devanagari Extra" w:cs="BRH Devanagari Extra"/>
@@ -4928,6 +6543,7 @@
               </w:rPr>
               <w:t>cÉiÉþxÉë</w:t>
             </w:r>
+            <w:proofErr w:type="spellEnd"/>
             <w:r>
               <w:rPr>
                 <w:rFonts w:ascii="BRH Tamil Tab Extra" w:hAnsi="BRH Tamil Tab Extra" w:cs="BRH Devanagari Extra"/>
@@ -4938,16 +6554,29 @@
               </w:rPr>
               <w:t>…</w:t>
             </w:r>
-            <w:r>
-              <w:rPr>
-                <w:rFonts w:ascii="BRH Devanagari Extra" w:hAnsi="BRH Devanagari Extra" w:cs="BRH Devanagari Extra"/>
-                <w:color w:val="000000"/>
-                <w:sz w:val="40"/>
-                <w:szCs w:val="40"/>
-                <w:lang w:bidi="ml-IN"/>
-              </w:rPr>
-              <w:t xml:space="preserve">xiuÉrÉÉÿ | </w:t>
-            </w:r>
+            <w:proofErr w:type="spellStart"/>
+            <w:r>
+              <w:rPr>
+                <w:rFonts w:ascii="BRH Devanagari Extra" w:hAnsi="BRH Devanagari Extra" w:cs="BRH Devanagari Extra"/>
+                <w:color w:val="000000"/>
+                <w:sz w:val="40"/>
+                <w:szCs w:val="40"/>
+                <w:lang w:bidi="ml-IN"/>
+              </w:rPr>
+              <w:t>xiuÉrÉÉÿ</w:t>
+            </w:r>
+            <w:proofErr w:type="spellEnd"/>
+            <w:r>
+              <w:rPr>
+                <w:rFonts w:ascii="BRH Devanagari Extra" w:hAnsi="BRH Devanagari Extra" w:cs="BRH Devanagari Extra"/>
+                <w:color w:val="000000"/>
+                <w:sz w:val="40"/>
+                <w:szCs w:val="40"/>
+                <w:lang w:bidi="ml-IN"/>
+              </w:rPr>
+              <w:t xml:space="preserve"> | </w:t>
+            </w:r>
+            <w:proofErr w:type="spellStart"/>
             <w:r>
               <w:rPr>
                 <w:rFonts w:ascii="BRH Devanagari Extra" w:hAnsi="BRH Devanagari Extra" w:cs="BRH Devanagari Extra"/>
@@ -4967,7 +6596,18 @@
                 <w:szCs w:val="40"/>
                 <w:lang w:bidi="ml-IN"/>
               </w:rPr>
-              <w:t>rÉÉÅSèkrÉþ¤ÉåhÉ |</w:t>
+              <w:t>rÉÉÅSèkrÉþ¤ÉåhÉ</w:t>
+            </w:r>
+            <w:proofErr w:type="spellEnd"/>
+            <w:r>
+              <w:rPr>
+                <w:rFonts w:ascii="BRH Devanagari Extra" w:hAnsi="BRH Devanagari Extra" w:cs="BRH Devanagari Extra"/>
+                <w:color w:val="000000"/>
+                <w:sz w:val="40"/>
+                <w:szCs w:val="40"/>
+                <w:lang w:bidi="ml-IN"/>
+              </w:rPr>
+              <w:t xml:space="preserve"> |</w:t>
             </w:r>
           </w:p>
         </w:tc>
@@ -5108,6 +6748,7 @@
                 <w:szCs w:val="40"/>
               </w:rPr>
             </w:pPr>
+            <w:proofErr w:type="spellStart"/>
             <w:r>
               <w:rPr>
                 <w:rFonts w:ascii="BRH Devanagari Extra" w:hAnsi="BRH Devanagari Extra" w:cs="BRH Devanagari Extra"/>
@@ -5128,6 +6769,7 @@
               </w:rPr>
               <w:t>å</w:t>
             </w:r>
+            <w:proofErr w:type="spellEnd"/>
             <w:r>
               <w:rPr>
                 <w:rFonts w:ascii="BRH Tamil Tab Extra" w:hAnsi="BRH Tamil Tab Extra" w:cs="BRH Devanagari Extra"/>
@@ -5138,6 +6780,7 @@
               </w:rPr>
               <w:t>…</w:t>
             </w:r>
+            <w:proofErr w:type="spellStart"/>
             <w:r>
               <w:rPr>
                 <w:rFonts w:ascii="BRH Devanagari Extra" w:hAnsi="BRH Devanagari Extra" w:cs="BRH Devanagari Extra"/>
@@ -5148,6 +6791,7 @@
               </w:rPr>
               <w:t>uÉÉ</w:t>
             </w:r>
+            <w:proofErr w:type="spellEnd"/>
             <w:r>
               <w:rPr>
                 <w:rFonts w:ascii="BRH Tamil Tab Extra" w:hAnsi="BRH Tamil Tab Extra" w:cs="BRH Devanagari Extra"/>
@@ -5158,6 +6802,7 @@
               </w:rPr>
               <w:t>…</w:t>
             </w:r>
+            <w:proofErr w:type="spellStart"/>
             <w:r>
               <w:rPr>
                 <w:rFonts w:ascii="BRH Devanagari Extra" w:hAnsi="BRH Devanagari Extra" w:cs="BRH Devanagari Extra"/>
@@ -5178,6 +6823,7 @@
               </w:rPr>
               <w:t>å</w:t>
             </w:r>
+            <w:proofErr w:type="spellEnd"/>
             <w:r>
               <w:rPr>
                 <w:rFonts w:ascii="BRH Tamil Tab Extra" w:hAnsi="BRH Tamil Tab Extra" w:cs="BRH Devanagari Extra"/>
@@ -5196,7 +6842,18 @@
                 <w:szCs w:val="40"/>
                 <w:lang w:bidi="ml-IN"/>
               </w:rPr>
-              <w:t xml:space="preserve"> A</w:t>
+              <w:t xml:space="preserve"> </w:t>
+            </w:r>
+            <w:proofErr w:type="spellStart"/>
+            <w:r>
+              <w:rPr>
+                <w:rFonts w:ascii="BRH Devanagari Extra" w:hAnsi="BRH Devanagari Extra" w:cs="BRH Devanagari Extra"/>
+                <w:color w:val="000000"/>
+                <w:sz w:val="40"/>
+                <w:szCs w:val="40"/>
+                <w:lang w:bidi="ml-IN"/>
+              </w:rPr>
+              <w:t>A</w:t>
             </w:r>
             <w:r>
               <w:rPr>
@@ -5209,6 +6866,7 @@
               </w:rPr>
               <w:t>ÍkÉþÈ</w:t>
             </w:r>
+            <w:proofErr w:type="spellEnd"/>
             <w:r>
               <w:rPr>
                 <w:rFonts w:ascii="BRH Devanagari Extra" w:hAnsi="BRH Devanagari Extra" w:cs="BRH Devanagari Extra"/>
@@ -5219,15 +6877,38 @@
               </w:rPr>
               <w:t xml:space="preserve"> | </w:t>
             </w:r>
-            <w:r>
-              <w:rPr>
-                <w:rFonts w:ascii="BRH Devanagari Extra" w:hAnsi="BRH Devanagari Extra" w:cs="BRH Devanagari Extra"/>
-                <w:color w:val="000000"/>
-                <w:sz w:val="40"/>
-                <w:szCs w:val="40"/>
-                <w:lang w:bidi="ml-IN"/>
-              </w:rPr>
-              <w:t>AÍkÉþ uÉÉ</w:t>
+            <w:proofErr w:type="spellStart"/>
+            <w:r>
+              <w:rPr>
+                <w:rFonts w:ascii="BRH Devanagari Extra" w:hAnsi="BRH Devanagari Extra" w:cs="BRH Devanagari Extra"/>
+                <w:color w:val="000000"/>
+                <w:sz w:val="40"/>
+                <w:szCs w:val="40"/>
+                <w:lang w:bidi="ml-IN"/>
+              </w:rPr>
+              <w:t>AÍkÉþ</w:t>
+            </w:r>
+            <w:proofErr w:type="spellEnd"/>
+            <w:r>
+              <w:rPr>
+                <w:rFonts w:ascii="BRH Devanagari Extra" w:hAnsi="BRH Devanagari Extra" w:cs="BRH Devanagari Extra"/>
+                <w:color w:val="000000"/>
+                <w:sz w:val="40"/>
+                <w:szCs w:val="40"/>
+                <w:lang w:bidi="ml-IN"/>
+              </w:rPr>
+              <w:t xml:space="preserve"> </w:t>
+            </w:r>
+            <w:proofErr w:type="spellStart"/>
+            <w:r>
+              <w:rPr>
+                <w:rFonts w:ascii="BRH Devanagari Extra" w:hAnsi="BRH Devanagari Extra" w:cs="BRH Devanagari Extra"/>
+                <w:color w:val="000000"/>
+                <w:sz w:val="40"/>
+                <w:szCs w:val="40"/>
+                <w:lang w:bidi="ml-IN"/>
+              </w:rPr>
+              <w:t>uÉÉ</w:t>
             </w:r>
             <w:r>
               <w:rPr>
@@ -5247,7 +6928,18 @@
                 <w:szCs w:val="40"/>
                 <w:lang w:bidi="ml-IN"/>
               </w:rPr>
-              <w:t>cÉiÉ |</w:t>
+              <w:t>cÉiÉ</w:t>
+            </w:r>
+            <w:proofErr w:type="spellEnd"/>
+            <w:r>
+              <w:rPr>
+                <w:rFonts w:ascii="BRH Devanagari Extra" w:hAnsi="BRH Devanagari Extra" w:cs="BRH Devanagari Extra"/>
+                <w:color w:val="000000"/>
+                <w:sz w:val="40"/>
+                <w:szCs w:val="40"/>
+                <w:lang w:bidi="ml-IN"/>
+              </w:rPr>
+              <w:t xml:space="preserve"> |</w:t>
             </w:r>
           </w:p>
         </w:tc>
@@ -5269,6 +6961,7 @@
                 <w:szCs w:val="40"/>
               </w:rPr>
             </w:pPr>
+            <w:proofErr w:type="spellStart"/>
             <w:r>
               <w:rPr>
                 <w:rFonts w:ascii="BRH Devanagari Extra" w:hAnsi="BRH Devanagari Extra" w:cs="BRH Devanagari Extra"/>
@@ -5289,6 +6982,7 @@
               </w:rPr>
               <w:t>å</w:t>
             </w:r>
+            <w:proofErr w:type="spellEnd"/>
             <w:r>
               <w:rPr>
                 <w:rFonts w:ascii="BRH Tamil Tab Extra" w:hAnsi="BRH Tamil Tab Extra" w:cs="BRH Devanagari Extra"/>
@@ -5299,6 +6993,7 @@
               </w:rPr>
               <w:t>…</w:t>
             </w:r>
+            <w:proofErr w:type="spellStart"/>
             <w:r>
               <w:rPr>
                 <w:rFonts w:ascii="BRH Devanagari Extra" w:hAnsi="BRH Devanagari Extra" w:cs="BRH Devanagari Extra"/>
@@ -5309,6 +7004,7 @@
               </w:rPr>
               <w:t>uÉÉ</w:t>
             </w:r>
+            <w:proofErr w:type="spellEnd"/>
             <w:r>
               <w:rPr>
                 <w:rFonts w:ascii="BRH Tamil Tab Extra" w:hAnsi="BRH Tamil Tab Extra" w:cs="BRH Devanagari Extra"/>
@@ -5319,6 +7015,7 @@
               </w:rPr>
               <w:t>…</w:t>
             </w:r>
+            <w:proofErr w:type="spellStart"/>
             <w:r>
               <w:rPr>
                 <w:rFonts w:ascii="BRH Devanagari Extra" w:hAnsi="BRH Devanagari Extra" w:cs="BRH Devanagari Extra"/>
@@ -5339,6 +7036,7 @@
               </w:rPr>
               <w:t>å</w:t>
             </w:r>
+            <w:proofErr w:type="spellEnd"/>
             <w:r>
               <w:rPr>
                 <w:rFonts w:ascii="BRH Tamil Tab Extra" w:hAnsi="BRH Tamil Tab Extra" w:cs="BRH Devanagari Extra"/>
@@ -5357,7 +7055,18 @@
                 <w:szCs w:val="40"/>
                 <w:lang w:bidi="ml-IN"/>
               </w:rPr>
-              <w:t xml:space="preserve"> A</w:t>
+              <w:t xml:space="preserve"> </w:t>
+            </w:r>
+            <w:proofErr w:type="spellStart"/>
+            <w:r>
+              <w:rPr>
+                <w:rFonts w:ascii="BRH Devanagari Extra" w:hAnsi="BRH Devanagari Extra" w:cs="BRH Devanagari Extra"/>
+                <w:color w:val="000000"/>
+                <w:sz w:val="40"/>
+                <w:szCs w:val="40"/>
+                <w:lang w:bidi="ml-IN"/>
+              </w:rPr>
+              <w:t>A</w:t>
             </w:r>
             <w:r>
               <w:rPr>
@@ -5378,17 +7087,51 @@
                 <w:szCs w:val="40"/>
                 <w:lang w:bidi="ml-IN"/>
               </w:rPr>
-              <w:t xml:space="preserve">þ | </w:t>
-            </w:r>
-            <w:r>
-              <w:rPr>
-                <w:rFonts w:ascii="BRH Devanagari Extra" w:hAnsi="BRH Devanagari Extra" w:cs="BRH Devanagari Extra"/>
-                <w:color w:val="000000"/>
-                <w:sz w:val="40"/>
-                <w:szCs w:val="40"/>
-                <w:lang w:bidi="ml-IN"/>
-              </w:rPr>
-              <w:t>AÍkÉþ uÉÉ</w:t>
+              <w:t>þ</w:t>
+            </w:r>
+            <w:proofErr w:type="spellEnd"/>
+            <w:r>
+              <w:rPr>
+                <w:rFonts w:ascii="BRH Devanagari Extra" w:hAnsi="BRH Devanagari Extra" w:cs="BRH Devanagari Extra"/>
+                <w:color w:val="000000"/>
+                <w:sz w:val="40"/>
+                <w:szCs w:val="40"/>
+                <w:lang w:bidi="ml-IN"/>
+              </w:rPr>
+              <w:t xml:space="preserve"> | </w:t>
+            </w:r>
+            <w:proofErr w:type="spellStart"/>
+            <w:r>
+              <w:rPr>
+                <w:rFonts w:ascii="BRH Devanagari Extra" w:hAnsi="BRH Devanagari Extra" w:cs="BRH Devanagari Extra"/>
+                <w:color w:val="000000"/>
+                <w:sz w:val="40"/>
+                <w:szCs w:val="40"/>
+                <w:lang w:bidi="ml-IN"/>
+              </w:rPr>
+              <w:t>AÍkÉþ</w:t>
+            </w:r>
+            <w:proofErr w:type="spellEnd"/>
+            <w:r>
+              <w:rPr>
+                <w:rFonts w:ascii="BRH Devanagari Extra" w:hAnsi="BRH Devanagari Extra" w:cs="BRH Devanagari Extra"/>
+                <w:color w:val="000000"/>
+                <w:sz w:val="40"/>
+                <w:szCs w:val="40"/>
+                <w:lang w:bidi="ml-IN"/>
+              </w:rPr>
+              <w:t xml:space="preserve"> </w:t>
+            </w:r>
+            <w:proofErr w:type="spellStart"/>
+            <w:r>
+              <w:rPr>
+                <w:rFonts w:ascii="BRH Devanagari Extra" w:hAnsi="BRH Devanagari Extra" w:cs="BRH Devanagari Extra"/>
+                <w:color w:val="000000"/>
+                <w:sz w:val="40"/>
+                <w:szCs w:val="40"/>
+                <w:lang w:bidi="ml-IN"/>
+              </w:rPr>
+              <w:t>uÉÉ</w:t>
             </w:r>
             <w:r>
               <w:rPr>
@@ -5408,7 +7151,18 @@
                 <w:szCs w:val="40"/>
                 <w:lang w:bidi="ml-IN"/>
               </w:rPr>
-              <w:t xml:space="preserve">cÉiÉ </w:t>
+              <w:t>cÉiÉ</w:t>
+            </w:r>
+            <w:proofErr w:type="spellEnd"/>
+            <w:r>
+              <w:rPr>
+                <w:rFonts w:ascii="BRH Devanagari Extra" w:hAnsi="BRH Devanagari Extra" w:cs="BRH Devanagari Extra"/>
+                <w:color w:val="000000"/>
+                <w:sz w:val="40"/>
+                <w:szCs w:val="40"/>
+                <w:lang w:bidi="ml-IN"/>
+              </w:rPr>
+              <w:t xml:space="preserve"> </w:t>
             </w:r>
             <w:proofErr w:type="gramStart"/>
             <w:r>
@@ -5438,6 +7192,7 @@
               </w:rPr>
               <w:t>(</w:t>
             </w:r>
+            <w:proofErr w:type="spellStart"/>
             <w:proofErr w:type="gramEnd"/>
             <w:r>
               <w:rPr>
@@ -5446,6 +7201,7 @@
               </w:rPr>
               <w:t>visaram</w:t>
             </w:r>
+            <w:proofErr w:type="spellEnd"/>
             <w:r>
               <w:rPr>
                 <w:rFonts w:ascii="Cambria" w:eastAsia="Times New Roman" w:hAnsi="Cambria" w:cs="BRH Malayalam Extra"/>
@@ -5603,6 +7359,7 @@
                 <w:lang w:bidi="ml-IN"/>
               </w:rPr>
             </w:pPr>
+            <w:proofErr w:type="spellStart"/>
             <w:r>
               <w:rPr>
                 <w:rFonts w:ascii="BRH Devanagari Extra" w:hAnsi="BRH Devanagari Extra" w:cs="BRH Devanagari Extra"/>
@@ -5613,6 +7370,7 @@
               </w:rPr>
               <w:t>WÒû</w:t>
             </w:r>
+            <w:proofErr w:type="spellEnd"/>
             <w:r>
               <w:rPr>
                 <w:rFonts w:ascii="BRH Tamil Tab Extra" w:hAnsi="BRH Tamil Tab Extra" w:cs="BRH Devanagari Extra"/>
@@ -5623,6 +7381,7 @@
               </w:rPr>
               <w:t>…</w:t>
             </w:r>
+            <w:proofErr w:type="spellStart"/>
             <w:r>
               <w:rPr>
                 <w:rFonts w:ascii="BRH Devanagari Extra" w:hAnsi="BRH Devanagari Extra" w:cs="BRH Devanagari Extra"/>
@@ -5643,6 +7402,7 @@
               </w:rPr>
               <w:t>å</w:t>
             </w:r>
+            <w:proofErr w:type="spellEnd"/>
             <w:r>
               <w:rPr>
                 <w:rFonts w:ascii="BRH Tamil Tab Extra" w:hAnsi="BRH Tamil Tab Extra" w:cs="BRH Devanagari Extra"/>
@@ -5663,6 +7423,7 @@
               </w:rPr>
               <w:t xml:space="preserve"> </w:t>
             </w:r>
+            <w:proofErr w:type="spellStart"/>
             <w:r>
               <w:rPr>
                 <w:rFonts w:ascii="BRH Devanagari Extra" w:hAnsi="BRH Devanagari Extra" w:cs="BRH Devanagari Extra"/>
@@ -5674,6 +7435,7 @@
               </w:rPr>
               <w:t>xÉÔ</w:t>
             </w:r>
+            <w:proofErr w:type="spellEnd"/>
             <w:r>
               <w:rPr>
                 <w:rFonts w:ascii="BRH Tamil Tab Extra" w:hAnsi="BRH Tamil Tab Extra" w:cs="BRH Devanagari Extra"/>
@@ -5685,16 +7447,40 @@
               </w:rPr>
               <w:t>…</w:t>
             </w:r>
-            <w:r>
-              <w:rPr>
-                <w:rFonts w:ascii="BRH Devanagari Extra" w:hAnsi="BRH Devanagari Extra" w:cs="BRH Devanagari Extra"/>
-                <w:color w:val="000000"/>
-                <w:sz w:val="40"/>
-                <w:szCs w:val="40"/>
-                <w:lang w:bidi="ml-IN"/>
-              </w:rPr>
-              <w:t>rÉqÉÉlÉçþ | xÉÑ</w:t>
-            </w:r>
+            <w:proofErr w:type="spellStart"/>
+            <w:r>
+              <w:rPr>
+                <w:rFonts w:ascii="BRH Devanagari Extra" w:hAnsi="BRH Devanagari Extra" w:cs="BRH Devanagari Extra"/>
+                <w:color w:val="000000"/>
+                <w:sz w:val="40"/>
+                <w:szCs w:val="40"/>
+                <w:lang w:bidi="ml-IN"/>
+              </w:rPr>
+              <w:t>rÉqÉÉlÉçþ</w:t>
+            </w:r>
+            <w:proofErr w:type="spellEnd"/>
+            <w:r>
+              <w:rPr>
+                <w:rFonts w:ascii="BRH Devanagari Extra" w:hAnsi="BRH Devanagari Extra" w:cs="BRH Devanagari Extra"/>
+                <w:color w:val="000000"/>
+                <w:sz w:val="40"/>
+                <w:szCs w:val="40"/>
+                <w:lang w:bidi="ml-IN"/>
+              </w:rPr>
+              <w:t xml:space="preserve"> | </w:t>
+            </w:r>
+            <w:proofErr w:type="spellStart"/>
+            <w:r>
+              <w:rPr>
+                <w:rFonts w:ascii="BRH Devanagari Extra" w:hAnsi="BRH Devanagari Extra" w:cs="BRH Devanagari Extra"/>
+                <w:color w:val="000000"/>
+                <w:sz w:val="40"/>
+                <w:szCs w:val="40"/>
+                <w:lang w:bidi="ml-IN"/>
+              </w:rPr>
+              <w:t>xÉÑ</w:t>
+            </w:r>
+            <w:proofErr w:type="spellEnd"/>
             <w:r>
               <w:rPr>
                 <w:rFonts w:ascii="BRH Tamil Tab Extra" w:hAnsi="BRH Tamil Tab Extra" w:cs="BRH Devanagari Extra"/>
@@ -5705,6 +7491,7 @@
               </w:rPr>
               <w:t>…</w:t>
             </w:r>
+            <w:proofErr w:type="spellStart"/>
             <w:r>
               <w:rPr>
                 <w:rFonts w:ascii="BRH Devanagari Extra" w:hAnsi="BRH Devanagari Extra" w:cs="BRH Devanagari Extra"/>
@@ -5715,6 +7502,7 @@
               </w:rPr>
               <w:t>rÉqÉÉþlÉÔ</w:t>
             </w:r>
+            <w:proofErr w:type="spellEnd"/>
             <w:r>
               <w:rPr>
                 <w:rFonts w:ascii="BRH Tamil Tab Extra" w:hAnsi="BRH Tamil Tab Extra" w:cs="BRH Devanagari Extra"/>
@@ -5725,6 +7513,7 @@
               </w:rPr>
               <w:t>…</w:t>
             </w:r>
+            <w:proofErr w:type="spellStart"/>
             <w:r>
               <w:rPr>
                 <w:rFonts w:ascii="BRH Devanagari Extra" w:hAnsi="BRH Devanagari Extra" w:cs="BRH Devanagari Extra"/>
@@ -5753,7 +7542,18 @@
                 <w:szCs w:val="40"/>
                 <w:lang w:bidi="ml-IN"/>
               </w:rPr>
-              <w:t>ÿ |</w:t>
+              <w:t>ÿ</w:t>
+            </w:r>
+            <w:proofErr w:type="spellEnd"/>
+            <w:r>
+              <w:rPr>
+                <w:rFonts w:ascii="BRH Devanagari Extra" w:hAnsi="BRH Devanagari Extra" w:cs="BRH Devanagari Extra"/>
+                <w:color w:val="000000"/>
+                <w:sz w:val="40"/>
+                <w:szCs w:val="40"/>
+                <w:lang w:bidi="ml-IN"/>
+              </w:rPr>
+              <w:t xml:space="preserve"> |</w:t>
             </w:r>
           </w:p>
         </w:tc>
@@ -5776,6 +7576,7 @@
                 <w:lang w:bidi="ml-IN"/>
               </w:rPr>
             </w:pPr>
+            <w:proofErr w:type="spellStart"/>
             <w:r>
               <w:rPr>
                 <w:rFonts w:ascii="BRH Devanagari Extra" w:hAnsi="BRH Devanagari Extra" w:cs="BRH Devanagari Extra"/>
@@ -5786,6 +7587,7 @@
               </w:rPr>
               <w:t>WÒû</w:t>
             </w:r>
+            <w:proofErr w:type="spellEnd"/>
             <w:r>
               <w:rPr>
                 <w:rFonts w:ascii="BRH Tamil Tab Extra" w:hAnsi="BRH Tamil Tab Extra" w:cs="BRH Devanagari Extra"/>
@@ -5796,6 +7598,7 @@
               </w:rPr>
               <w:t>…</w:t>
             </w:r>
+            <w:proofErr w:type="spellStart"/>
             <w:r>
               <w:rPr>
                 <w:rFonts w:ascii="BRH Devanagari Extra" w:hAnsi="BRH Devanagari Extra" w:cs="BRH Devanagari Extra"/>
@@ -5816,6 +7619,7 @@
               </w:rPr>
               <w:t>å</w:t>
             </w:r>
+            <w:proofErr w:type="spellEnd"/>
             <w:r>
               <w:rPr>
                 <w:rFonts w:ascii="BRH Tamil Tab Extra" w:hAnsi="BRH Tamil Tab Extra" w:cs="BRH Devanagari Extra"/>
@@ -5836,6 +7640,7 @@
               </w:rPr>
               <w:t xml:space="preserve"> </w:t>
             </w:r>
+            <w:proofErr w:type="spellStart"/>
             <w:r>
               <w:rPr>
                 <w:rFonts w:ascii="BRH Devanagari Extra" w:hAnsi="BRH Devanagari Extra" w:cs="BRH Devanagari Extra"/>
@@ -5857,6 +7662,7 @@
               </w:rPr>
               <w:t>Ñ</w:t>
             </w:r>
+            <w:proofErr w:type="spellEnd"/>
             <w:r>
               <w:rPr>
                 <w:rFonts w:ascii="BRH Tamil Tab Extra" w:hAnsi="BRH Tamil Tab Extra" w:cs="BRH Devanagari Extra"/>
@@ -5867,16 +7673,40 @@
               </w:rPr>
               <w:t>…</w:t>
             </w:r>
-            <w:r>
-              <w:rPr>
-                <w:rFonts w:ascii="BRH Devanagari Extra" w:hAnsi="BRH Devanagari Extra" w:cs="BRH Devanagari Extra"/>
-                <w:color w:val="000000"/>
-                <w:sz w:val="40"/>
-                <w:szCs w:val="40"/>
-                <w:lang w:bidi="ml-IN"/>
-              </w:rPr>
-              <w:t>rÉqÉÉlÉçþ | xÉÑ</w:t>
-            </w:r>
+            <w:proofErr w:type="spellStart"/>
+            <w:r>
+              <w:rPr>
+                <w:rFonts w:ascii="BRH Devanagari Extra" w:hAnsi="BRH Devanagari Extra" w:cs="BRH Devanagari Extra"/>
+                <w:color w:val="000000"/>
+                <w:sz w:val="40"/>
+                <w:szCs w:val="40"/>
+                <w:lang w:bidi="ml-IN"/>
+              </w:rPr>
+              <w:t>rÉqÉÉlÉçþ</w:t>
+            </w:r>
+            <w:proofErr w:type="spellEnd"/>
+            <w:r>
+              <w:rPr>
+                <w:rFonts w:ascii="BRH Devanagari Extra" w:hAnsi="BRH Devanagari Extra" w:cs="BRH Devanagari Extra"/>
+                <w:color w:val="000000"/>
+                <w:sz w:val="40"/>
+                <w:szCs w:val="40"/>
+                <w:lang w:bidi="ml-IN"/>
+              </w:rPr>
+              <w:t xml:space="preserve"> | </w:t>
+            </w:r>
+            <w:proofErr w:type="spellStart"/>
+            <w:r>
+              <w:rPr>
+                <w:rFonts w:ascii="BRH Devanagari Extra" w:hAnsi="BRH Devanagari Extra" w:cs="BRH Devanagari Extra"/>
+                <w:color w:val="000000"/>
+                <w:sz w:val="40"/>
+                <w:szCs w:val="40"/>
+                <w:lang w:bidi="ml-IN"/>
+              </w:rPr>
+              <w:t>xÉÑ</w:t>
+            </w:r>
+            <w:proofErr w:type="spellEnd"/>
             <w:r>
               <w:rPr>
                 <w:rFonts w:ascii="BRH Tamil Tab Extra" w:hAnsi="BRH Tamil Tab Extra" w:cs="BRH Devanagari Extra"/>
@@ -5887,6 +7717,7 @@
               </w:rPr>
               <w:t>…</w:t>
             </w:r>
+            <w:proofErr w:type="spellStart"/>
             <w:r>
               <w:rPr>
                 <w:rFonts w:ascii="BRH Devanagari Extra" w:hAnsi="BRH Devanagari Extra" w:cs="BRH Devanagari Extra"/>
@@ -5897,6 +7728,7 @@
               </w:rPr>
               <w:t>rÉqÉÉþlÉÔ</w:t>
             </w:r>
+            <w:proofErr w:type="spellEnd"/>
             <w:r>
               <w:rPr>
                 <w:rFonts w:ascii="BRH Tamil Tab Extra" w:hAnsi="BRH Tamil Tab Extra" w:cs="BRH Devanagari Extra"/>
@@ -5907,6 +7739,7 @@
               </w:rPr>
               <w:t>…</w:t>
             </w:r>
+            <w:proofErr w:type="spellStart"/>
             <w:r>
               <w:rPr>
                 <w:rFonts w:ascii="BRH Devanagari Extra" w:hAnsi="BRH Devanagari Extra" w:cs="BRH Devanagari Extra"/>
@@ -5935,7 +7768,18 @@
                 <w:szCs w:val="40"/>
                 <w:lang w:bidi="ml-IN"/>
               </w:rPr>
-              <w:t>ÿ |</w:t>
+              <w:t>ÿ</w:t>
+            </w:r>
+            <w:proofErr w:type="spellEnd"/>
+            <w:r>
+              <w:rPr>
+                <w:rFonts w:ascii="BRH Devanagari Extra" w:hAnsi="BRH Devanagari Extra" w:cs="BRH Devanagari Extra"/>
+                <w:color w:val="000000"/>
+                <w:sz w:val="40"/>
+                <w:szCs w:val="40"/>
+                <w:lang w:bidi="ml-IN"/>
+              </w:rPr>
+              <w:t xml:space="preserve"> |</w:t>
             </w:r>
             <w:r>
               <w:rPr>
@@ -5964,12 +7808,21 @@
               </w:rPr>
               <w:t xml:space="preserve"> </w:t>
             </w:r>
+            <w:proofErr w:type="spellStart"/>
             <w:r>
               <w:rPr>
                 <w:b/>
                 <w:bCs/>
               </w:rPr>
-              <w:t>hraswam)</w:t>
+              <w:t>hraswam</w:t>
+            </w:r>
+            <w:proofErr w:type="spellEnd"/>
+            <w:r>
+              <w:rPr>
+                <w:b/>
+                <w:bCs/>
+              </w:rPr>
+              <w:t>)</w:t>
             </w:r>
           </w:p>
         </w:tc>
@@ -6111,6 +7964,7 @@
                 <w:lang w:bidi="ml-IN"/>
               </w:rPr>
             </w:pPr>
+            <w:proofErr w:type="spellStart"/>
             <w:r>
               <w:rPr>
                 <w:rFonts w:ascii="BRH Devanagari Extra" w:hAnsi="BRH Devanagari Extra" w:cs="BRH Devanagari Extra"/>
@@ -6121,6 +7975,7 @@
               </w:rPr>
               <w:t>xÉÑ</w:t>
             </w:r>
+            <w:proofErr w:type="spellEnd"/>
             <w:r>
               <w:rPr>
                 <w:rFonts w:ascii="BRH Tamil Tab Extra" w:hAnsi="BRH Tamil Tab Extra" w:cs="BRH Devanagari Extra"/>
@@ -6131,6 +7986,7 @@
               </w:rPr>
               <w:t>…</w:t>
             </w:r>
+            <w:proofErr w:type="spellStart"/>
             <w:r>
               <w:rPr>
                 <w:rFonts w:ascii="BRH Devanagari Extra" w:hAnsi="BRH Devanagari Extra" w:cs="BRH Devanagari Extra"/>
@@ -6141,6 +7997,7 @@
               </w:rPr>
               <w:t>rÉqÉÉ</w:t>
             </w:r>
+            <w:proofErr w:type="spellEnd"/>
             <w:r>
               <w:rPr>
                 <w:rFonts w:ascii="BRH Tamil Tab Extra" w:hAnsi="BRH Tamil Tab Extra" w:cs="BRH Devanagari Extra"/>
@@ -6151,15 +8008,60 @@
               </w:rPr>
               <w:t>…</w:t>
             </w:r>
-            <w:r>
-              <w:rPr>
-                <w:rFonts w:ascii="BRH Devanagari Extra" w:hAnsi="BRH Devanagari Extra" w:cs="BRH Devanagari Extra"/>
-                <w:color w:val="000000"/>
-                <w:sz w:val="40"/>
-                <w:szCs w:val="40"/>
-                <w:lang w:bidi="ml-IN"/>
-              </w:rPr>
-              <w:t>ÌlÉÌiÉþ xÉÑ - rÉqÉÉ</w:t>
+            <w:proofErr w:type="spellStart"/>
+            <w:r>
+              <w:rPr>
+                <w:rFonts w:ascii="BRH Devanagari Extra" w:hAnsi="BRH Devanagari Extra" w:cs="BRH Devanagari Extra"/>
+                <w:color w:val="000000"/>
+                <w:sz w:val="40"/>
+                <w:szCs w:val="40"/>
+                <w:lang w:bidi="ml-IN"/>
+              </w:rPr>
+              <w:t>ÌlÉÌiÉþ</w:t>
+            </w:r>
+            <w:proofErr w:type="spellEnd"/>
+            <w:r>
+              <w:rPr>
+                <w:rFonts w:ascii="BRH Devanagari Extra" w:hAnsi="BRH Devanagari Extra" w:cs="BRH Devanagari Extra"/>
+                <w:color w:val="000000"/>
+                <w:sz w:val="40"/>
+                <w:szCs w:val="40"/>
+                <w:lang w:bidi="ml-IN"/>
+              </w:rPr>
+              <w:t xml:space="preserve"> </w:t>
+            </w:r>
+            <w:proofErr w:type="spellStart"/>
+            <w:r>
+              <w:rPr>
+                <w:rFonts w:ascii="BRH Devanagari Extra" w:hAnsi="BRH Devanagari Extra" w:cs="BRH Devanagari Extra"/>
+                <w:color w:val="000000"/>
+                <w:sz w:val="40"/>
+                <w:szCs w:val="40"/>
+                <w:lang w:bidi="ml-IN"/>
+              </w:rPr>
+              <w:t>xÉÑ</w:t>
+            </w:r>
+            <w:proofErr w:type="spellEnd"/>
+            <w:r>
+              <w:rPr>
+                <w:rFonts w:ascii="BRH Devanagari Extra" w:hAnsi="BRH Devanagari Extra" w:cs="BRH Devanagari Extra"/>
+                <w:color w:val="000000"/>
+                <w:sz w:val="40"/>
+                <w:szCs w:val="40"/>
+                <w:lang w:bidi="ml-IN"/>
+              </w:rPr>
+              <w:t xml:space="preserve"> - </w:t>
+            </w:r>
+            <w:proofErr w:type="spellStart"/>
+            <w:r>
+              <w:rPr>
+                <w:rFonts w:ascii="BRH Devanagari Extra" w:hAnsi="BRH Devanagari Extra" w:cs="BRH Devanagari Extra"/>
+                <w:color w:val="000000"/>
+                <w:sz w:val="40"/>
+                <w:szCs w:val="40"/>
+                <w:lang w:bidi="ml-IN"/>
+              </w:rPr>
+              <w:t>rÉqÉÉ</w:t>
             </w:r>
             <w:r>
               <w:rPr>
@@ -6180,7 +8082,18 @@
                 <w:szCs w:val="40"/>
                 <w:lang w:bidi="ml-IN"/>
               </w:rPr>
-              <w:t>ç |</w:t>
+              <w:t>ç</w:t>
+            </w:r>
+            <w:proofErr w:type="spellEnd"/>
+            <w:r>
+              <w:rPr>
+                <w:rFonts w:ascii="BRH Devanagari Extra" w:hAnsi="BRH Devanagari Extra" w:cs="BRH Devanagari Extra"/>
+                <w:color w:val="000000"/>
+                <w:sz w:val="40"/>
+                <w:szCs w:val="40"/>
+                <w:lang w:bidi="ml-IN"/>
+              </w:rPr>
+              <w:t xml:space="preserve"> |</w:t>
             </w:r>
           </w:p>
         </w:tc>
@@ -6203,6 +8116,7 @@
                 <w:lang w:bidi="ml-IN"/>
               </w:rPr>
             </w:pPr>
+            <w:proofErr w:type="spellStart"/>
             <w:r>
               <w:rPr>
                 <w:rFonts w:ascii="BRH Devanagari Extra" w:hAnsi="BRH Devanagari Extra" w:cs="BRH Devanagari Extra"/>
@@ -6213,6 +8127,7 @@
               </w:rPr>
               <w:t>xÉÑ</w:t>
             </w:r>
+            <w:proofErr w:type="spellEnd"/>
             <w:r>
               <w:rPr>
                 <w:rFonts w:ascii="BRH Tamil Tab Extra" w:hAnsi="BRH Tamil Tab Extra" w:cs="BRH Devanagari Extra"/>
@@ -6223,6 +8138,7 @@
               </w:rPr>
               <w:t>…</w:t>
             </w:r>
+            <w:proofErr w:type="spellStart"/>
             <w:r>
               <w:rPr>
                 <w:rFonts w:ascii="BRH Devanagari Extra" w:hAnsi="BRH Devanagari Extra" w:cs="BRH Devanagari Extra"/>
@@ -6233,6 +8149,7 @@
               </w:rPr>
               <w:t>rÉqÉÉ</w:t>
             </w:r>
+            <w:proofErr w:type="spellEnd"/>
             <w:r>
               <w:rPr>
                 <w:rFonts w:ascii="BRH Tamil Tab Extra" w:hAnsi="BRH Tamil Tab Extra" w:cs="BRH Devanagari Extra"/>
@@ -6243,15 +8160,60 @@
               </w:rPr>
               <w:t>…</w:t>
             </w:r>
-            <w:r>
-              <w:rPr>
-                <w:rFonts w:ascii="BRH Devanagari Extra" w:hAnsi="BRH Devanagari Extra" w:cs="BRH Devanagari Extra"/>
-                <w:color w:val="000000"/>
-                <w:sz w:val="40"/>
-                <w:szCs w:val="40"/>
-                <w:lang w:bidi="ml-IN"/>
-              </w:rPr>
-              <w:t>ÌlÉÌiÉþ xÉÑ - rÉqÉÉ</w:t>
+            <w:proofErr w:type="spellStart"/>
+            <w:r>
+              <w:rPr>
+                <w:rFonts w:ascii="BRH Devanagari Extra" w:hAnsi="BRH Devanagari Extra" w:cs="BRH Devanagari Extra"/>
+                <w:color w:val="000000"/>
+                <w:sz w:val="40"/>
+                <w:szCs w:val="40"/>
+                <w:lang w:bidi="ml-IN"/>
+              </w:rPr>
+              <w:t>ÌlÉÌiÉþ</w:t>
+            </w:r>
+            <w:proofErr w:type="spellEnd"/>
+            <w:r>
+              <w:rPr>
+                <w:rFonts w:ascii="BRH Devanagari Extra" w:hAnsi="BRH Devanagari Extra" w:cs="BRH Devanagari Extra"/>
+                <w:color w:val="000000"/>
+                <w:sz w:val="40"/>
+                <w:szCs w:val="40"/>
+                <w:lang w:bidi="ml-IN"/>
+              </w:rPr>
+              <w:t xml:space="preserve"> </w:t>
+            </w:r>
+            <w:proofErr w:type="spellStart"/>
+            <w:r>
+              <w:rPr>
+                <w:rFonts w:ascii="BRH Devanagari Extra" w:hAnsi="BRH Devanagari Extra" w:cs="BRH Devanagari Extra"/>
+                <w:color w:val="000000"/>
+                <w:sz w:val="40"/>
+                <w:szCs w:val="40"/>
+                <w:lang w:bidi="ml-IN"/>
+              </w:rPr>
+              <w:t>xÉÑ</w:t>
+            </w:r>
+            <w:proofErr w:type="spellEnd"/>
+            <w:r>
+              <w:rPr>
+                <w:rFonts w:ascii="BRH Devanagari Extra" w:hAnsi="BRH Devanagari Extra" w:cs="BRH Devanagari Extra"/>
+                <w:color w:val="000000"/>
+                <w:sz w:val="40"/>
+                <w:szCs w:val="40"/>
+                <w:lang w:bidi="ml-IN"/>
+              </w:rPr>
+              <w:t xml:space="preserve"> - </w:t>
+            </w:r>
+            <w:proofErr w:type="spellStart"/>
+            <w:r>
+              <w:rPr>
+                <w:rFonts w:ascii="BRH Devanagari Extra" w:hAnsi="BRH Devanagari Extra" w:cs="BRH Devanagari Extra"/>
+                <w:color w:val="000000"/>
+                <w:sz w:val="40"/>
+                <w:szCs w:val="40"/>
+                <w:lang w:bidi="ml-IN"/>
+              </w:rPr>
+              <w:t>rÉqÉÉ</w:t>
             </w:r>
             <w:r>
               <w:rPr>
@@ -6264,6 +8226,7 @@
               </w:rPr>
               <w:t>lÉçþ</w:t>
             </w:r>
+            <w:proofErr w:type="spellEnd"/>
             <w:r>
               <w:rPr>
                 <w:rFonts w:ascii="BRH Devanagari Extra" w:hAnsi="BRH Devanagari Extra" w:cs="BRH Devanagari Extra"/>
@@ -6312,6 +8275,7 @@
                 <w:sz w:val="28"/>
                 <w:szCs w:val="32"/>
               </w:rPr>
+              <w:lastRenderedPageBreak/>
               <w:t>T.S.4.7.15.7 – Kramam</w:t>
             </w:r>
           </w:p>
@@ -6434,6 +8398,7 @@
               </w:rPr>
               <w:t>…</w:t>
             </w:r>
+            <w:proofErr w:type="spellStart"/>
             <w:r>
               <w:rPr>
                 <w:rFonts w:ascii="BRH Devanagari Extra" w:hAnsi="BRH Devanagari Extra" w:cs="BRH Devanagari Extra"/>
@@ -6454,6 +8419,7 @@
               </w:rPr>
               <w:t>å</w:t>
             </w:r>
+            <w:proofErr w:type="spellEnd"/>
             <w:r>
               <w:rPr>
                 <w:rFonts w:ascii="BRH Tamil Tab Extra" w:hAnsi="BRH Tamil Tab Extra" w:cs="BRH Devanagari Extra"/>
@@ -6472,8 +8438,20 @@
                 <w:szCs w:val="40"/>
                 <w:lang w:bidi="ml-IN"/>
               </w:rPr>
-              <w:t xml:space="preserve"> mÉë</w:t>
-            </w:r>
+              <w:t xml:space="preserve"> </w:t>
+            </w:r>
+            <w:proofErr w:type="spellStart"/>
+            <w:r>
+              <w:rPr>
+                <w:rFonts w:ascii="BRH Devanagari Extra" w:hAnsi="BRH Devanagari Extra" w:cs="BRH Devanagari Extra"/>
+                <w:color w:val="000000"/>
+                <w:sz w:val="40"/>
+                <w:szCs w:val="40"/>
+                <w:lang w:bidi="ml-IN"/>
+              </w:rPr>
+              <w:t>mÉë</w:t>
+            </w:r>
+            <w:proofErr w:type="spellEnd"/>
             <w:r>
               <w:rPr>
                 <w:rFonts w:ascii="BRH Tamil Tab Extra" w:hAnsi="BRH Tamil Tab Extra" w:cs="BRH Devanagari Extra"/>
@@ -6504,16 +8482,40 @@
               </w:rPr>
               <w:t>…</w:t>
             </w:r>
-            <w:r>
-              <w:rPr>
-                <w:rFonts w:ascii="BRH Devanagari Extra" w:hAnsi="BRH Devanagari Extra" w:cs="BRH Devanagari Extra"/>
-                <w:color w:val="000000"/>
-                <w:sz w:val="40"/>
-                <w:szCs w:val="40"/>
-                <w:lang w:bidi="ml-IN"/>
-              </w:rPr>
-              <w:t>UÉqÉç | mÉë</w:t>
-            </w:r>
+            <w:proofErr w:type="spellStart"/>
+            <w:r>
+              <w:rPr>
+                <w:rFonts w:ascii="BRH Devanagari Extra" w:hAnsi="BRH Devanagari Extra" w:cs="BRH Devanagari Extra"/>
+                <w:color w:val="000000"/>
+                <w:sz w:val="40"/>
+                <w:szCs w:val="40"/>
+                <w:lang w:bidi="ml-IN"/>
+              </w:rPr>
+              <w:t>UÉqÉç</w:t>
+            </w:r>
+            <w:proofErr w:type="spellEnd"/>
+            <w:r>
+              <w:rPr>
+                <w:rFonts w:ascii="BRH Devanagari Extra" w:hAnsi="BRH Devanagari Extra" w:cs="BRH Devanagari Extra"/>
+                <w:color w:val="000000"/>
+                <w:sz w:val="40"/>
+                <w:szCs w:val="40"/>
+                <w:lang w:bidi="ml-IN"/>
+              </w:rPr>
+              <w:t xml:space="preserve"> | </w:t>
+            </w:r>
+            <w:proofErr w:type="spellStart"/>
+            <w:r>
+              <w:rPr>
+                <w:rFonts w:ascii="BRH Devanagari Extra" w:hAnsi="BRH Devanagari Extra" w:cs="BRH Devanagari Extra"/>
+                <w:color w:val="000000"/>
+                <w:sz w:val="40"/>
+                <w:szCs w:val="40"/>
+                <w:lang w:bidi="ml-IN"/>
+              </w:rPr>
+              <w:t>mÉë</w:t>
+            </w:r>
+            <w:proofErr w:type="spellEnd"/>
             <w:r>
               <w:rPr>
                 <w:rFonts w:ascii="BRH Tamil Tab Extra" w:hAnsi="BRH Tamil Tab Extra" w:cs="BRH Devanagari Extra"/>
@@ -6544,16 +8546,29 @@
               </w:rPr>
               <w:t>…</w:t>
             </w:r>
-            <w:r>
-              <w:rPr>
-                <w:rFonts w:ascii="BRH Devanagari Extra" w:hAnsi="BRH Devanagari Extra" w:cs="BRH Devanagari Extra"/>
-                <w:color w:val="000000"/>
-                <w:sz w:val="40"/>
-                <w:szCs w:val="40"/>
-                <w:lang w:bidi="ml-IN"/>
-              </w:rPr>
-              <w:t xml:space="preserve">UÉqÉç </w:t>
-            </w:r>
+            <w:proofErr w:type="spellStart"/>
+            <w:r>
+              <w:rPr>
+                <w:rFonts w:ascii="BRH Devanagari Extra" w:hAnsi="BRH Devanagari Extra" w:cs="BRH Devanagari Extra"/>
+                <w:color w:val="000000"/>
+                <w:sz w:val="40"/>
+                <w:szCs w:val="40"/>
+                <w:lang w:bidi="ml-IN"/>
+              </w:rPr>
+              <w:t>UÉqÉç</w:t>
+            </w:r>
+            <w:proofErr w:type="spellEnd"/>
+            <w:r>
+              <w:rPr>
+                <w:rFonts w:ascii="BRH Devanagari Extra" w:hAnsi="BRH Devanagari Extra" w:cs="BRH Devanagari Extra"/>
+                <w:color w:val="000000"/>
+                <w:sz w:val="40"/>
+                <w:szCs w:val="40"/>
+                <w:lang w:bidi="ml-IN"/>
+              </w:rPr>
+              <w:t xml:space="preserve"> </w:t>
+            </w:r>
+            <w:proofErr w:type="spellStart"/>
             <w:r>
               <w:rPr>
                 <w:rFonts w:ascii="BRH Devanagari Extra" w:hAnsi="BRH Devanagari Extra" w:cs="BRH Devanagari Extra"/>
@@ -6573,7 +8588,18 @@
                 <w:szCs w:val="40"/>
                 <w:lang w:bidi="ml-IN"/>
               </w:rPr>
-              <w:t>È |</w:t>
+              <w:t>È</w:t>
+            </w:r>
+            <w:proofErr w:type="spellEnd"/>
+            <w:r>
+              <w:rPr>
+                <w:rFonts w:ascii="BRH Devanagari Extra" w:hAnsi="BRH Devanagari Extra" w:cs="BRH Devanagari Extra"/>
+                <w:color w:val="000000"/>
+                <w:sz w:val="40"/>
+                <w:szCs w:val="40"/>
+                <w:lang w:bidi="ml-IN"/>
+              </w:rPr>
+              <w:t xml:space="preserve"> |</w:t>
             </w:r>
           </w:p>
         </w:tc>
@@ -6616,6 +8642,7 @@
               </w:rPr>
               <w:t>…</w:t>
             </w:r>
+            <w:proofErr w:type="spellStart"/>
             <w:r>
               <w:rPr>
                 <w:rFonts w:ascii="BRH Devanagari Extra" w:hAnsi="BRH Devanagari Extra" w:cs="BRH Devanagari Extra"/>
@@ -6636,6 +8663,7 @@
               </w:rPr>
               <w:t>å</w:t>
             </w:r>
+            <w:proofErr w:type="spellEnd"/>
             <w:r>
               <w:rPr>
                 <w:rFonts w:ascii="BRH Tamil Tab Extra" w:hAnsi="BRH Tamil Tab Extra" w:cs="BRH Devanagari Extra"/>
@@ -6654,8 +8682,20 @@
                 <w:szCs w:val="40"/>
                 <w:lang w:bidi="ml-IN"/>
               </w:rPr>
-              <w:t xml:space="preserve"> mÉë</w:t>
-            </w:r>
+              <w:t xml:space="preserve"> </w:t>
+            </w:r>
+            <w:proofErr w:type="spellStart"/>
+            <w:r>
+              <w:rPr>
+                <w:rFonts w:ascii="BRH Devanagari Extra" w:hAnsi="BRH Devanagari Extra" w:cs="BRH Devanagari Extra"/>
+                <w:color w:val="000000"/>
+                <w:sz w:val="40"/>
+                <w:szCs w:val="40"/>
+                <w:lang w:bidi="ml-IN"/>
+              </w:rPr>
+              <w:t>mÉë</w:t>
+            </w:r>
+            <w:proofErr w:type="spellEnd"/>
             <w:r>
               <w:rPr>
                 <w:rFonts w:ascii="BRH Tamil Tab Extra" w:hAnsi="BRH Tamil Tab Extra" w:cs="BRH Devanagari Extra"/>
@@ -6686,16 +8726,40 @@
               </w:rPr>
               <w:t>…</w:t>
             </w:r>
-            <w:r>
-              <w:rPr>
-                <w:rFonts w:ascii="BRH Devanagari Extra" w:hAnsi="BRH Devanagari Extra" w:cs="BRH Devanagari Extra"/>
-                <w:color w:val="000000"/>
-                <w:sz w:val="40"/>
-                <w:szCs w:val="40"/>
-                <w:lang w:bidi="ml-IN"/>
-              </w:rPr>
-              <w:t>UÉqÉç | mÉë</w:t>
-            </w:r>
+            <w:proofErr w:type="spellStart"/>
+            <w:r>
+              <w:rPr>
+                <w:rFonts w:ascii="BRH Devanagari Extra" w:hAnsi="BRH Devanagari Extra" w:cs="BRH Devanagari Extra"/>
+                <w:color w:val="000000"/>
+                <w:sz w:val="40"/>
+                <w:szCs w:val="40"/>
+                <w:lang w:bidi="ml-IN"/>
+              </w:rPr>
+              <w:t>UÉqÉç</w:t>
+            </w:r>
+            <w:proofErr w:type="spellEnd"/>
+            <w:r>
+              <w:rPr>
+                <w:rFonts w:ascii="BRH Devanagari Extra" w:hAnsi="BRH Devanagari Extra" w:cs="BRH Devanagari Extra"/>
+                <w:color w:val="000000"/>
+                <w:sz w:val="40"/>
+                <w:szCs w:val="40"/>
+                <w:lang w:bidi="ml-IN"/>
+              </w:rPr>
+              <w:t xml:space="preserve"> | </w:t>
+            </w:r>
+            <w:proofErr w:type="spellStart"/>
+            <w:r>
+              <w:rPr>
+                <w:rFonts w:ascii="BRH Devanagari Extra" w:hAnsi="BRH Devanagari Extra" w:cs="BRH Devanagari Extra"/>
+                <w:color w:val="000000"/>
+                <w:sz w:val="40"/>
+                <w:szCs w:val="40"/>
+                <w:lang w:bidi="ml-IN"/>
+              </w:rPr>
+              <w:t>mÉë</w:t>
+            </w:r>
+            <w:proofErr w:type="spellEnd"/>
             <w:r>
               <w:rPr>
                 <w:rFonts w:ascii="BRH Tamil Tab Extra" w:hAnsi="BRH Tamil Tab Extra" w:cs="BRH Devanagari Extra"/>
@@ -6726,16 +8790,29 @@
               </w:rPr>
               <w:t>…</w:t>
             </w:r>
-            <w:r>
-              <w:rPr>
-                <w:rFonts w:ascii="BRH Devanagari Extra" w:hAnsi="BRH Devanagari Extra" w:cs="BRH Devanagari Extra"/>
-                <w:color w:val="000000"/>
-                <w:sz w:val="40"/>
-                <w:szCs w:val="40"/>
-                <w:lang w:bidi="ml-IN"/>
-              </w:rPr>
-              <w:t xml:space="preserve">UÉqÉç </w:t>
-            </w:r>
+            <w:proofErr w:type="spellStart"/>
+            <w:r>
+              <w:rPr>
+                <w:rFonts w:ascii="BRH Devanagari Extra" w:hAnsi="BRH Devanagari Extra" w:cs="BRH Devanagari Extra"/>
+                <w:color w:val="000000"/>
+                <w:sz w:val="40"/>
+                <w:szCs w:val="40"/>
+                <w:lang w:bidi="ml-IN"/>
+              </w:rPr>
+              <w:t>UÉqÉç</w:t>
+            </w:r>
+            <w:proofErr w:type="spellEnd"/>
+            <w:r>
+              <w:rPr>
+                <w:rFonts w:ascii="BRH Devanagari Extra" w:hAnsi="BRH Devanagari Extra" w:cs="BRH Devanagari Extra"/>
+                <w:color w:val="000000"/>
+                <w:sz w:val="40"/>
+                <w:szCs w:val="40"/>
+                <w:lang w:bidi="ml-IN"/>
+              </w:rPr>
+              <w:t xml:space="preserve"> </w:t>
+            </w:r>
+            <w:proofErr w:type="spellStart"/>
             <w:r>
               <w:rPr>
                 <w:rFonts w:ascii="BRH Devanagari Extra" w:hAnsi="BRH Devanagari Extra" w:cs="BRH Devanagari Extra"/>
@@ -6747,6 +8824,7 @@
               </w:rPr>
               <w:t>lÉþÈ</w:t>
             </w:r>
+            <w:proofErr w:type="spellEnd"/>
             <w:r>
               <w:rPr>
                 <w:rFonts w:ascii="BRH Devanagari Extra" w:hAnsi="BRH Devanagari Extra" w:cs="BRH Devanagari Extra"/>
@@ -6789,7 +8867,29 @@
           <w:szCs w:val="40"/>
           <w:lang w:val="en-IN" w:eastAsia="en-IN"/>
         </w:rPr>
-        <w:t xml:space="preserve">"zlÉ" </w:t>
+        <w:t>"</w:t>
+      </w:r>
+      <w:proofErr w:type="spellStart"/>
+      <w:r>
+        <w:rPr>
+          <w:rFonts w:ascii="BRH Devanagari" w:hAnsi="BRH Devanagari" w:cs="BRH Devanagari"/>
+          <w:color w:val="000000"/>
+          <w:sz w:val="40"/>
+          <w:szCs w:val="40"/>
+          <w:lang w:val="en-IN" w:eastAsia="en-IN"/>
+        </w:rPr>
+        <w:t>zlÉ</w:t>
+      </w:r>
+      <w:proofErr w:type="spellEnd"/>
+      <w:r>
+        <w:rPr>
+          <w:rFonts w:ascii="BRH Devanagari" w:hAnsi="BRH Devanagari" w:cs="BRH Devanagari"/>
+          <w:color w:val="000000"/>
+          <w:sz w:val="40"/>
+          <w:szCs w:val="40"/>
+          <w:lang w:val="en-IN" w:eastAsia="en-IN"/>
+        </w:rPr>
+        <w:t xml:space="preserve">" </w:t>
       </w:r>
       <w:r>
         <w:rPr>
@@ -6828,6 +8928,7 @@
         </w:rPr>
         <w:t>"</w:t>
       </w:r>
+      <w:proofErr w:type="spellStart"/>
       <w:proofErr w:type="gramEnd"/>
       <w:r>
         <w:rPr>
@@ -6840,6 +8941,7 @@
         </w:rPr>
         <w:t>zgÉ</w:t>
       </w:r>
+      <w:proofErr w:type="spellEnd"/>
       <w:r>
         <w:rPr>
           <w:rFonts w:ascii="BRH Devanagari" w:hAnsi="BRH Devanagari" w:cs="BRH Devanagari"/>
@@ -6861,6 +8963,9 @@
     </w:p>
     <w:p>
       <w:pPr>
+        <w:pBdr>
+          <w:bottom w:val="double" w:sz="6" w:space="1" w:color="auto"/>
+        </w:pBdr>
         <w:jc w:val="center"/>
         <w:rPr>
           <w:b/>
@@ -6870,7 +8975,10 @@
           <w:u w:val="single"/>
         </w:rPr>
       </w:pPr>
-      <w:r>
+    </w:p>
+    <w:p>
+      <w:pPr>
+        <w:jc w:val="center"/>
         <w:rPr>
           <w:b/>
           <w:bCs/>
@@ -6878,8 +8986,19 @@
           <w:szCs w:val="32"/>
           <w:u w:val="single"/>
         </w:rPr>
-        <w:t>=========================</w:t>
-      </w:r>
+      </w:pPr>
+    </w:p>
+    <w:p>
+      <w:pPr>
+        <w:jc w:val="center"/>
+        <w:rPr>
+          <w:b/>
+          <w:bCs/>
+          <w:sz w:val="32"/>
+          <w:szCs w:val="32"/>
+          <w:u w:val="single"/>
+        </w:rPr>
+      </w:pPr>
     </w:p>
     <w:p>
       <w:pPr>
@@ -7084,7 +9203,6 @@
                 <w:sz w:val="32"/>
                 <w:szCs w:val="32"/>
               </w:rPr>
-              <w:lastRenderedPageBreak/>
               <w:t>Section, Paragraph</w:t>
             </w:r>
           </w:p>
@@ -7264,6 +9382,8 @@
       <w:headerReference w:type="default" r:id="rId8"/>
       <w:footerReference w:type="even" r:id="rId9"/>
       <w:footerReference w:type="default" r:id="rId10"/>
+      <w:headerReference w:type="first" r:id="rId11"/>
+      <w:footerReference w:type="first" r:id="rId12"/>
       <w:pgSz w:w="15840" w:h="12240" w:orient="landscape"/>
       <w:pgMar w:top="1440" w:right="1440" w:bottom="1440" w:left="1440" w:header="720" w:footer="720" w:gutter="0"/>
       <w:cols w:space="720"/>
@@ -7352,14 +9472,35 @@
         <w:bCs/>
       </w:rPr>
       <w:tab/>
-      <w:t xml:space="preserve">              v</w:t>
+      <w:t xml:space="preserve">              </w:t>
     </w:r>
     <w:r>
       <w:rPr>
         <w:b/>
         <w:bCs/>
       </w:rPr>
-      <w:t>edavms@gmail.com</w:t>
+      <w:t>www.</w:t>
+    </w:r>
+    <w:r>
+      <w:rPr>
+        <w:b/>
+        <w:bCs/>
+      </w:rPr>
+      <w:t>v</w:t>
+    </w:r>
+    <w:r>
+      <w:rPr>
+        <w:b/>
+        <w:bCs/>
+      </w:rPr>
+      <w:t>edavms</w:t>
+    </w:r>
+    <w:r>
+      <w:rPr>
+        <w:b/>
+        <w:bCs/>
+      </w:rPr>
+      <w:t>.in</w:t>
     </w:r>
     <w:r>
       <w:rPr>
@@ -7378,6 +9519,9 @@
     </w:r>
     <w:r>
       <w:tab/>
+    </w:r>
+    <w:r>
+      <w:t xml:space="preserve">                      </w:t>
     </w:r>
     <w:r>
       <w:tab/>
@@ -7572,6 +9716,13 @@
       <w:t xml:space="preserve"> </w:t>
     </w:r>
     <w:r>
+      <w:rPr>
+        <w:b/>
+        <w:bCs/>
+      </w:rPr>
+      <w:t xml:space="preserve">           </w:t>
+    </w:r>
+    <w:r>
       <w:tab/>
     </w:r>
     <w:r>
@@ -7683,6 +9834,16 @@
 </w:ftr>
 </file>
 
+<file path=word/footer3.xml><?xml version="1.0" encoding="utf-8"?>
+<w:ftr xmlns:wpc="http://schemas.microsoft.com/office/word/2010/wordprocessingCanvas" xmlns:cx="http://schemas.microsoft.com/office/drawing/2014/chartex" xmlns:cx1="http://schemas.microsoft.com/office/drawing/2015/9/8/chartex" xmlns:cx2="http://schemas.microsoft.com/office/drawing/2015/10/21/chartex" xmlns:cx3="http://schemas.microsoft.com/office/drawing/2016/5/9/chartex" xmlns:cx4="http://schemas.microsoft.com/office/drawing/2016/5/10/chartex" xmlns:cx5="http://schemas.microsoft.com/office/drawing/2016/5/11/chartex" xmlns:cx6="http://schemas.microsoft.com/office/drawing/2016/5/12/chartex" xmlns:cx7="http://schemas.microsoft.com/office/drawing/2016/5/13/chartex" xmlns:cx8="http://schemas.microsoft.com/office/drawing/2016/5/14/chartex" xmlns:mc="http://schemas.openxmlformats.org/markup-compatibility/2006" xmlns:aink="http://schemas.microsoft.com/office/drawing/2016/ink" xmlns:am3d="http://schemas.microsoft.com/office/drawing/2017/model3d" xmlns:o="urn:schemas-microsoft-com:office:office" xmlns:oel="http://schemas.microsoft.com/office/2019/extlst" xmlns:r="http://schemas.openxmlformats.org/officeDocument/2006/relationships" xmlns:m="http://schemas.openxmlformats.org/officeDocument/2006/math" xmlns:v="urn:schemas-microsoft-com:vml" xmlns:wp14="http://schemas.microsoft.com/office/word/2010/wordprocessingDrawing" xmlns:wp="http://schemas.openxmlformats.org/drawingml/2006/wordprocessingDrawing" xmlns:w10="urn:schemas-microsoft-com:office:word" xmlns:w="http://schemas.openxmlformats.org/wordprocessingml/2006/main" xmlns:w14="http://schemas.microsoft.com/office/word/2010/wordml" xmlns:w15="http://schemas.microsoft.com/office/word/2012/wordml" xmlns:w16cex="http://schemas.microsoft.com/office/word/2018/wordml/cex" xmlns:w16cid="http://schemas.microsoft.com/office/word/2016/wordml/cid" xmlns:w16="http://schemas.microsoft.com/office/word/2018/wordml" xmlns:w16du="http://schemas.microsoft.com/office/word/2023/wordml/word16du" xmlns:w16sdtdh="http://schemas.microsoft.com/office/word/2020/wordml/sdtdatahash" xmlns:w16sdtfl="http://schemas.microsoft.com/office/word/2024/wordml/sdtformatlock" xmlns:w16se="http://schemas.microsoft.com/office/word/2015/wordml/symex" xmlns:wpg="http://schemas.microsoft.com/office/word/2010/wordprocessingGroup" xmlns:wpi="http://schemas.microsoft.com/office/word/2010/wordprocessingInk" xmlns:wne="http://schemas.microsoft.com/office/word/2006/wordml" xmlns:wps="http://schemas.microsoft.com/office/word/2010/wordprocessingShape" mc:Ignorable="w14 w15 w16se w16cid w16 w16cex w16sdtdh w16sdtfl w16du wp14">
+  <w:p>
+    <w:pPr>
+      <w:pStyle w:val="Footer"/>
+    </w:pPr>
+  </w:p>
+</w:ftr>
+</file>
+
 <file path=word/footnotes.xml><?xml version="1.0" encoding="utf-8"?>
 <w:footnotes xmlns:wpc="http://schemas.microsoft.com/office/word/2010/wordprocessingCanvas" xmlns:cx="http://schemas.microsoft.com/office/drawing/2014/chartex" xmlns:cx1="http://schemas.microsoft.com/office/drawing/2015/9/8/chartex" xmlns:cx2="http://schemas.microsoft.com/office/drawing/2015/10/21/chartex" xmlns:cx3="http://schemas.microsoft.com/office/drawing/2016/5/9/chartex" xmlns:cx4="http://schemas.microsoft.com/office/drawing/2016/5/10/chartex" xmlns:cx5="http://schemas.microsoft.com/office/drawing/2016/5/11/chartex" xmlns:cx6="http://schemas.microsoft.com/office/drawing/2016/5/12/chartex" xmlns:cx7="http://schemas.microsoft.com/office/drawing/2016/5/13/chartex" xmlns:cx8="http://schemas.microsoft.com/office/drawing/2016/5/14/chartex" xmlns:mc="http://schemas.openxmlformats.org/markup-compatibility/2006" xmlns:aink="http://schemas.microsoft.com/office/drawing/2016/ink" xmlns:am3d="http://schemas.microsoft.com/office/drawing/2017/model3d" xmlns:o="urn:schemas-microsoft-com:office:office" xmlns:oel="http://schemas.microsoft.com/office/2019/extlst" xmlns:r="http://schemas.openxmlformats.org/officeDocument/2006/relationships" xmlns:m="http://schemas.openxmlformats.org/officeDocument/2006/math" xmlns:v="urn:schemas-microsoft-com:vml" xmlns:wp14="http://schemas.microsoft.com/office/word/2010/wordprocessingDrawing" xmlns:wp="http://schemas.openxmlformats.org/drawingml/2006/wordprocessingDrawing" xmlns:w10="urn:schemas-microsoft-com:office:word" xmlns:w="http://schemas.openxmlformats.org/wordprocessingml/2006/main" xmlns:w14="http://schemas.microsoft.com/office/word/2010/wordml" xmlns:w15="http://schemas.microsoft.com/office/word/2012/wordml" xmlns:w16cex="http://schemas.microsoft.com/office/word/2018/wordml/cex" xmlns:w16cid="http://schemas.microsoft.com/office/word/2016/wordml/cid" xmlns:w16="http://schemas.microsoft.com/office/word/2018/wordml" xmlns:w16du="http://schemas.microsoft.com/office/word/2023/wordml/word16du" xmlns:w16sdtdh="http://schemas.microsoft.com/office/word/2020/wordml/sdtdatahash" xmlns:w16sdtfl="http://schemas.microsoft.com/office/word/2024/wordml/sdtformatlock" xmlns:w16se="http://schemas.microsoft.com/office/word/2015/wordml/symex" xmlns:wpg="http://schemas.microsoft.com/office/word/2010/wordprocessingGroup" xmlns:wpi="http://schemas.microsoft.com/office/word/2010/wordprocessingInk" xmlns:wne="http://schemas.microsoft.com/office/word/2006/wordml" xmlns:wps="http://schemas.microsoft.com/office/word/2010/wordprocessingShape" mc:Ignorable="w14 w15 w16se w16cid w16 w16cex w16sdtdh w16sdtfl w16du wp14">
   <w:footnote w:type="separator" w:id="-1">
@@ -7729,6 +9890,16 @@
       <w:pBdr>
         <w:bottom w:val="single" w:sz="4" w:space="1" w:color="auto"/>
       </w:pBdr>
+    </w:pPr>
+  </w:p>
+</w:hdr>
+</file>
+
+<file path=word/header3.xml><?xml version="1.0" encoding="utf-8"?>
+<w:hdr xmlns:wpc="http://schemas.microsoft.com/office/word/2010/wordprocessingCanvas" xmlns:cx="http://schemas.microsoft.com/office/drawing/2014/chartex" xmlns:cx1="http://schemas.microsoft.com/office/drawing/2015/9/8/chartex" xmlns:cx2="http://schemas.microsoft.com/office/drawing/2015/10/21/chartex" xmlns:cx3="http://schemas.microsoft.com/office/drawing/2016/5/9/chartex" xmlns:cx4="http://schemas.microsoft.com/office/drawing/2016/5/10/chartex" xmlns:cx5="http://schemas.microsoft.com/office/drawing/2016/5/11/chartex" xmlns:cx6="http://schemas.microsoft.com/office/drawing/2016/5/12/chartex" xmlns:cx7="http://schemas.microsoft.com/office/drawing/2016/5/13/chartex" xmlns:cx8="http://schemas.microsoft.com/office/drawing/2016/5/14/chartex" xmlns:mc="http://schemas.openxmlformats.org/markup-compatibility/2006" xmlns:aink="http://schemas.microsoft.com/office/drawing/2016/ink" xmlns:am3d="http://schemas.microsoft.com/office/drawing/2017/model3d" xmlns:o="urn:schemas-microsoft-com:office:office" xmlns:oel="http://schemas.microsoft.com/office/2019/extlst" xmlns:r="http://schemas.openxmlformats.org/officeDocument/2006/relationships" xmlns:m="http://schemas.openxmlformats.org/officeDocument/2006/math" xmlns:v="urn:schemas-microsoft-com:vml" xmlns:wp14="http://schemas.microsoft.com/office/word/2010/wordprocessingDrawing" xmlns:wp="http://schemas.openxmlformats.org/drawingml/2006/wordprocessingDrawing" xmlns:w10="urn:schemas-microsoft-com:office:word" xmlns:w="http://schemas.openxmlformats.org/wordprocessingml/2006/main" xmlns:w14="http://schemas.microsoft.com/office/word/2010/wordml" xmlns:w15="http://schemas.microsoft.com/office/word/2012/wordml" xmlns:w16cex="http://schemas.microsoft.com/office/word/2018/wordml/cex" xmlns:w16cid="http://schemas.microsoft.com/office/word/2016/wordml/cid" xmlns:w16="http://schemas.microsoft.com/office/word/2018/wordml" xmlns:w16du="http://schemas.microsoft.com/office/word/2023/wordml/word16du" xmlns:w16sdtdh="http://schemas.microsoft.com/office/word/2020/wordml/sdtdatahash" xmlns:w16sdtfl="http://schemas.microsoft.com/office/word/2024/wordml/sdtformatlock" xmlns:w16se="http://schemas.microsoft.com/office/word/2015/wordml/symex" xmlns:wpg="http://schemas.microsoft.com/office/word/2010/wordprocessingGroup" xmlns:wpi="http://schemas.microsoft.com/office/word/2010/wordprocessingInk" xmlns:wne="http://schemas.microsoft.com/office/word/2006/wordml" xmlns:wps="http://schemas.microsoft.com/office/word/2010/wordprocessingShape" mc:Ignorable="w14 w15 w16se w16cid w16 w16cex w16sdtdh w16sdtfl w16du wp14">
+  <w:p>
+    <w:pPr>
+      <w:pStyle w:val="Header"/>
     </w:pPr>
   </w:p>
 </w:hdr>

</xml_diff>